<commit_message>
KIO-08: Ajustar documentacion y guia de ejecucion a la demostracion local
La demostracion se hace ejecutando el sistema localmente desde Visual Studio
Code, no publicandolo en un servidor. Se ajusta la documentacion en
consecuencia:

- Las secciones de entorno operativo e implementacion describen la puesta en
  marcha local, con el procedimiento de los dos procesos y que se puede
  comprobar en la demostracion contra los valores de referencia.
- DESPLIEGUE.md pasa a ser la guia de puesta en marcha, con los modos de base
  de datos y el motivo por el que la demostracion corre en memoria.
- El recuento de pruebas automatizadas queda en 65, el que arroja la suite
  sobre la rama principal.
- El registro de prompts incorpora los commits del refuerzo de seguridad del
  inicio de sesion y el cierre de DEF-003.
- La evidencia de participacion queda con los commits efectivos de cada
  integrante.
</commit_message>
<xml_diff>
--- a/docs/entrega-final/Kiosky-Documentacion-Final.docx
+++ b/docs/entrega-final/Kiosky-Documentacion-Final.docx
@@ -1233,7 +1233,7 @@
           </w:pPr>
           <w:hyperlink w:history="1" w:anchor="_Toc48">
             <w:r>
-              <w:t xml:space="preserve">20.4. Elian Cavenatti. Tickets KIO-01 y KIO-02</w:t>
+              <w:t xml:space="preserve">20.4. Refuerzo de la seguridad del inicio de sesion. Ticket KIO-01</w:t>
             </w:r>
             <w:r>
               <w:tab/>
@@ -2183,7 +2183,7 @@
           </w:pPr>
           <w:hyperlink w:history="1" w:anchor="_Toc90">
             <w:r>
-              <w:t xml:space="preserve">36.3. Publicacion de la demostracion</w:t>
+              <w:t xml:space="preserve">36.3. Puesta en marcha del sistema</w:t>
             </w:r>
             <w:r>
               <w:tab/>
@@ -2206,7 +2206,7 @@
           </w:pPr>
           <w:hyperlink w:history="1" w:anchor="_Toc91">
             <w:r>
-              <w:t xml:space="preserve">36.4. Verificacion del caracter privado</w:t>
+              <w:t xml:space="preserve">36.4. Que se puede comprobar en la demostracion</w:t>
             </w:r>
             <w:r>
               <w:tab/>
@@ -2265,15 +2265,14 @@
         </w:p>
         <w:p>
           <w:pPr>
-            <w:pStyle w:val="TOC2"/>
+            <w:pStyle w:val="TOC1"/>
             <w:tabs>
               <w:tab w:val="right" w:pos="9360" w:leader="dot"/>
             </w:tabs>
-            <w:ind w:left="220"/>
           </w:pPr>
           <w:hyperlink w:history="1" w:anchor="_Toc94">
             <w:r>
-              <w:t xml:space="preserve">38.1. Trabajo pendiente</w:t>
+              <w:t xml:space="preserve">39. Glosario</w:t>
             </w:r>
             <w:r>
               <w:tab/>
@@ -2295,7 +2294,7 @@
           </w:pPr>
           <w:hyperlink w:history="1" w:anchor="_Toc95">
             <w:r>
-              <w:t xml:space="preserve">39. Glosario</w:t>
+              <w:t xml:space="preserve">40. Referencias</w:t>
             </w:r>
             <w:r>
               <w:tab/>
@@ -2303,28 +2302,6 @@
             <w:r>
               <w:fldChar w:fldCharType="begin" w:dirty="true"/>
               <w:instrText xml:space="preserve">PAGEREF _Toc95 \h</w:instrText>
-              <w:fldChar w:fldCharType="separate"/>
-              <w:fldChar w:fldCharType="end"/>
-            </w:r>
-          </w:hyperlink>
-        </w:p>
-        <w:p>
-          <w:pPr>
-            <w:pStyle w:val="TOC1"/>
-            <w:tabs>
-              <w:tab w:val="right" w:pos="9360" w:leader="dot"/>
-            </w:tabs>
-          </w:pPr>
-          <w:hyperlink w:history="1" w:anchor="_Toc96">
-            <w:r>
-              <w:t xml:space="preserve">40. Referencias</w:t>
-            </w:r>
-            <w:r>
-              <w:tab/>
-            </w:r>
-            <w:r>
-              <w:fldChar w:fldCharType="begin" w:dirty="true"/>
-              <w:instrText xml:space="preserve">PAGEREF _Toc96 \h</w:instrText>
               <w:fldChar w:fldCharType="separate"/>
               <w:fldChar w:fldCharType="end"/>
             </w:r>
@@ -2338,7 +2315,7 @@
             </w:tabs>
             <w:ind w:left="220"/>
           </w:pPr>
-          <w:hyperlink w:history="1" w:anchor="_Toc97">
+          <w:hyperlink w:history="1" w:anchor="_Toc96">
             <w:r>
               <w:t xml:space="preserve">40.1. Recursos de formacion consultados</w:t>
             </w:r>
@@ -2347,7 +2324,7 @@
             </w:r>
             <w:r>
               <w:fldChar w:fldCharType="begin" w:dirty="true"/>
-              <w:instrText xml:space="preserve">PAGEREF _Toc97 \h</w:instrText>
+              <w:instrText xml:space="preserve">PAGEREF _Toc96 \h</w:instrText>
               <w:fldChar w:fldCharType="separate"/>
               <w:fldChar w:fldCharType="end"/>
             </w:r>
@@ -2456,7 +2433,7 @@
           <w:sz w:val="24"/>
           <w:szCs w:val="24"/>
         </w:rPr>
-        <w:t xml:space="preserve">Al cierre de esta entrega el sistema se encuentra implementado y en funcionamiento: cuenta con ocho pantallas operativas, una interfaz de programacion de aplicaciones de veintiun rutas, una base de datos relacional de ocho tablas, 78 pruebas automatizadas, 129 casos de prueba documentados y un entorno de integracion continua que ejecuta las verificaciones en cada cambio enviado al repositorio.</w:t>
+        <w:t xml:space="preserve">Al cierre de esta entrega el sistema se encuentra implementado y en funcionamiento: cuenta con ocho pantallas operativas, una interfaz de programacion de aplicaciones de veintiun rutas, una base de datos relacional de ocho tablas, 65 pruebas automatizadas, 129 casos de prueba documentados y un entorno de integracion continua que ejecuta las verificaciones en cada cambio enviado al repositorio.</w:t>
       </w:r>
     </w:p>
     <w:p>
@@ -3216,7 +3193,7 @@
           <w:sz w:val="24"/>
           <w:szCs w:val="24"/>
         </w:rPr>
-        <w:t xml:space="preserve"> Finalmente se presenta el sistema al cliente, acompanado de su documentacion tecnica y funcional, y publicado en un entorno accesible para su revision.</w:t>
+        <w:t xml:space="preserve"> Finalmente se presenta el sistema al cliente en funcionamiento, acompanado de su documentacion tecnica y funcional.</w:t>
       </w:r>
     </w:p>
     <w:p>
@@ -3737,6 +3714,39 @@
     </w:p>
     <w:p>
       <w:pPr>
+        <w:pStyle w:val="Heading2"/>
+        <w:spacing w:after="120" w:before="240" w:line="480"/>
+      </w:pPr>
+      <w:bookmarkStart w:name="_Toc12" w:id="12"/>
+      <w:r>
+        <w:rPr>
+          <w:rFonts w:ascii="Times New Roman" w:cs="Times New Roman" w:eastAsia="Times New Roman" w:hAnsi="Times New Roman"/>
+          <w:b/>
+          <w:bCs/>
+          <w:sz w:val="24"/>
+          <w:szCs w:val="24"/>
+        </w:rPr>
+        <w:t xml:space="preserve">9.3. Recursos de software</w:t>
+      </w:r>
+      <w:bookmarkEnd w:id="12"/>
+    </w:p>
+    <w:p>
+      <w:pPr>
+        <w:spacing w:after="0" w:line="480"/>
+        <w:ind/>
+        <w:jc w:val="both"/>
+      </w:pPr>
+      <w:r>
+        <w:rPr>
+          <w:rFonts w:ascii="Times New Roman" w:cs="Times New Roman" w:eastAsia="Times New Roman" w:hAnsi="Times New Roman"/>
+          <w:sz w:val="24"/>
+          <w:szCs w:val="24"/>
+        </w:rPr>
+        <w:t xml:space="preserve">Las herramientas seleccionadas para el desarrollo del proyecto son:</w:t>
+      </w:r>
+    </w:p>
+    <w:p>
+      <w:pPr>
         <w:pStyle w:val="ListParagraph"/>
         <w:numPr>
           <w:ilvl w:val="0"/>
@@ -3751,40 +3761,7 @@
           <w:sz w:val="24"/>
           <w:szCs w:val="24"/>
         </w:rPr>
-        <w:t xml:space="preserve">Servidor virtual en la nube para la publicacion del sistema.</w:t>
-      </w:r>
-    </w:p>
-    <w:p>
-      <w:pPr>
-        <w:pStyle w:val="Heading2"/>
-        <w:spacing w:after="120" w:before="240" w:line="480"/>
-      </w:pPr>
-      <w:bookmarkStart w:name="_Toc12" w:id="12"/>
-      <w:r>
-        <w:rPr>
-          <w:rFonts w:ascii="Times New Roman" w:cs="Times New Roman" w:eastAsia="Times New Roman" w:hAnsi="Times New Roman"/>
-          <w:b/>
-          <w:bCs/>
-          <w:sz w:val="24"/>
-          <w:szCs w:val="24"/>
-        </w:rPr>
-        <w:t xml:space="preserve">9.3. Recursos de software</w:t>
-      </w:r>
-      <w:bookmarkEnd w:id="12"/>
-    </w:p>
-    <w:p>
-      <w:pPr>
-        <w:spacing w:after="0" w:line="480"/>
-        <w:ind/>
-        <w:jc w:val="both"/>
-      </w:pPr>
-      <w:r>
-        <w:rPr>
-          <w:rFonts w:ascii="Times New Roman" w:cs="Times New Roman" w:eastAsia="Times New Roman" w:hAnsi="Times New Roman"/>
-          <w:sz w:val="24"/>
-          <w:szCs w:val="24"/>
-        </w:rPr>
-        <w:t xml:space="preserve">Las herramientas seleccionadas para el desarrollo del proyecto son:</w:t>
+        <w:t xml:space="preserve">Visual Studio Code como entorno de desarrollo.</w:t>
       </w:r>
     </w:p>
     <w:p>
@@ -3803,7 +3780,7 @@
           <w:sz w:val="24"/>
           <w:szCs w:val="24"/>
         </w:rPr>
-        <w:t xml:space="preserve">Visual Studio Code como entorno de desarrollo.</w:t>
+        <w:t xml:space="preserve">React para el desarrollo del frontend, junto con HTML5, CSS3 y JavaScript.</w:t>
       </w:r>
     </w:p>
     <w:p>
@@ -3822,7 +3799,7 @@
           <w:sz w:val="24"/>
           <w:szCs w:val="24"/>
         </w:rPr>
-        <w:t xml:space="preserve">React para el desarrollo del frontend, junto con HTML5, CSS3 y JavaScript.</w:t>
+        <w:t xml:space="preserve">Node.js como entorno de ejecucion y Express como marco de trabajo para la interfaz de programacion de aplicaciones.</w:t>
       </w:r>
     </w:p>
     <w:p>
@@ -3841,7 +3818,7 @@
           <w:sz w:val="24"/>
           <w:szCs w:val="24"/>
         </w:rPr>
-        <w:t xml:space="preserve">Node.js como entorno de ejecucion y Express como marco de trabajo para la interfaz de programacion de aplicaciones.</w:t>
+        <w:t xml:space="preserve">MySQL como gestor de base de datos.</w:t>
       </w:r>
     </w:p>
     <w:p>
@@ -3860,7 +3837,7 @@
           <w:sz w:val="24"/>
           <w:szCs w:val="24"/>
         </w:rPr>
-        <w:t xml:space="preserve">MySQL como gestor de base de datos.</w:t>
+        <w:t xml:space="preserve">Git y GitHub para el control de versiones, la revision de codigo y la integracion continua.</w:t>
       </w:r>
     </w:p>
     <w:p>
@@ -3879,7 +3856,7 @@
           <w:sz w:val="24"/>
           <w:szCs w:val="24"/>
         </w:rPr>
-        <w:t xml:space="preserve">Git y GitHub para el control de versiones, la revision de codigo y la integracion continua.</w:t>
+        <w:t xml:space="preserve">Google Chrome y Mozilla Firefox para las pruebas del sistema.</w:t>
       </w:r>
     </w:p>
     <w:p>
@@ -3898,7 +3875,7 @@
           <w:sz w:val="24"/>
           <w:szCs w:val="24"/>
         </w:rPr>
-        <w:t xml:space="preserve">Google Chrome y Mozilla Firefox para las pruebas del sistema.</w:t>
+        <w:t xml:space="preserve">Figma para el diseno de los wireframes y Lucidchart para el diagrama entidad-relacion y el diagrama de Gantt.</w:t>
       </w:r>
     </w:p>
     <w:p>
@@ -3917,7 +3894,7 @@
           <w:sz w:val="24"/>
           <w:szCs w:val="24"/>
         </w:rPr>
-        <w:t xml:space="preserve">Figma para el diseno de los wireframes y Lucidchart para el diagrama entidad-relacion y el diagrama de Gantt.</w:t>
+        <w:t xml:space="preserve">Trello para la gestion de tickets.</w:t>
       </w:r>
     </w:p>
     <w:p>
@@ -3936,8 +3913,60 @@
           <w:sz w:val="24"/>
           <w:szCs w:val="24"/>
         </w:rPr>
-        <w:t xml:space="preserve">Trello para la gestion de tickets.</w:t>
-      </w:r>
+        <w:t xml:space="preserve">Herramientas de inteligencia artificial como asistencia al desarrollo.</w:t>
+      </w:r>
+    </w:p>
+    <w:p>
+      <w:pPr>
+        <w:spacing w:after="0" w:line="480"/>
+        <w:ind w:firstLine="720"/>
+        <w:jc w:val="both"/>
+      </w:pPr>
+      <w:r>
+        <w:rPr>
+          <w:rFonts w:ascii="Times New Roman" w:cs="Times New Roman" w:eastAsia="Times New Roman" w:hAnsi="Times New Roman"/>
+          <w:sz w:val="24"/>
+          <w:szCs w:val="24"/>
+        </w:rPr>
+        <w:t xml:space="preserve">La eleccion de estas tecnologias responde a su amplia utilizacion en el desarrollo web moderno, su disponibilidad gratuita y la experiencia previa del equipo con dichas herramientas.</w:t>
+      </w:r>
+    </w:p>
+    <w:p>
+      <w:pPr>
+        <w:pStyle w:val="Heading1"/>
+        <w:spacing w:after="240" w:before="360" w:line="480"/>
+        <w:jc w:val="center"/>
+      </w:pPr>
+      <w:bookmarkStart w:name="_Toc13" w:id="13"/>
+      <w:r>
+        <w:rPr>
+          <w:rFonts w:ascii="Times New Roman" w:cs="Times New Roman" w:eastAsia="Times New Roman" w:hAnsi="Times New Roman"/>
+          <w:b/>
+          <w:bCs/>
+          <w:sz w:val="24"/>
+          <w:szCs w:val="24"/>
+        </w:rPr>
+        <w:t xml:space="preserve">10. Funciones de los integrantes</w:t>
+      </w:r>
+      <w:bookmarkEnd w:id="13"/>
+    </w:p>
+    <w:p>
+      <w:pPr>
+        <w:pStyle w:val="Heading2"/>
+        <w:spacing w:after="120" w:before="240" w:line="480"/>
+      </w:pPr>
+      <w:bookmarkStart w:name="_Toc14" w:id="14"/>
+      <w:r>
+        <w:rPr>
+          <w:rFonts w:ascii="Times New Roman" w:cs="Times New Roman" w:eastAsia="Times New Roman" w:hAnsi="Times New Roman"/>
+          <w:b/>
+          <w:bCs/>
+          <w:sz w:val="24"/>
+          <w:szCs w:val="24"/>
+        </w:rPr>
+        <w:t xml:space="preserve">10.1. Lucas Beim</w:t>
+      </w:r>
+      <w:bookmarkEnd w:id="14"/>
     </w:p>
     <w:p>
       <w:pPr>
@@ -3955,7 +3984,7 @@
           <w:sz w:val="24"/>
           <w:szCs w:val="24"/>
         </w:rPr>
-        <w:t xml:space="preserve">Docker y Caddy para el empaquetado y la publicacion del sistema.</w:t>
+        <w:t xml:space="preserve">Desarrollo de la interfaz grafica.</w:t>
       </w:r>
     </w:p>
     <w:p>
@@ -3974,60 +4003,8 @@
           <w:sz w:val="24"/>
           <w:szCs w:val="24"/>
         </w:rPr>
-        <w:t xml:space="preserve">Herramientas de inteligencia artificial como asistencia al desarrollo.</w:t>
-      </w:r>
-    </w:p>
-    <w:p>
-      <w:pPr>
-        <w:spacing w:after="0" w:line="480"/>
-        <w:ind w:firstLine="720"/>
-        <w:jc w:val="both"/>
-      </w:pPr>
-      <w:r>
-        <w:rPr>
-          <w:rFonts w:ascii="Times New Roman" w:cs="Times New Roman" w:eastAsia="Times New Roman" w:hAnsi="Times New Roman"/>
-          <w:sz w:val="24"/>
-          <w:szCs w:val="24"/>
-        </w:rPr>
-        <w:t xml:space="preserve">La eleccion de estas tecnologias responde a su amplia utilizacion en el desarrollo web moderno, su disponibilidad gratuita y la experiencia previa del equipo con dichas herramientas.</w:t>
-      </w:r>
-    </w:p>
-    <w:p>
-      <w:pPr>
-        <w:pStyle w:val="Heading1"/>
-        <w:spacing w:after="240" w:before="360" w:line="480"/>
-        <w:jc w:val="center"/>
-      </w:pPr>
-      <w:bookmarkStart w:name="_Toc13" w:id="13"/>
-      <w:r>
-        <w:rPr>
-          <w:rFonts w:ascii="Times New Roman" w:cs="Times New Roman" w:eastAsia="Times New Roman" w:hAnsi="Times New Roman"/>
-          <w:b/>
-          <w:bCs/>
-          <w:sz w:val="24"/>
-          <w:szCs w:val="24"/>
-        </w:rPr>
-        <w:t xml:space="preserve">10. Funciones de los integrantes</w:t>
-      </w:r>
-      <w:bookmarkEnd w:id="13"/>
-    </w:p>
-    <w:p>
-      <w:pPr>
-        <w:pStyle w:val="Heading2"/>
-        <w:spacing w:after="120" w:before="240" w:line="480"/>
-      </w:pPr>
-      <w:bookmarkStart w:name="_Toc14" w:id="14"/>
-      <w:r>
-        <w:rPr>
-          <w:rFonts w:ascii="Times New Roman" w:cs="Times New Roman" w:eastAsia="Times New Roman" w:hAnsi="Times New Roman"/>
-          <w:b/>
-          <w:bCs/>
-          <w:sz w:val="24"/>
-          <w:szCs w:val="24"/>
-        </w:rPr>
-        <w:t xml:space="preserve">10.1. Lucas Beim</w:t>
-      </w:r>
-      <w:bookmarkEnd w:id="14"/>
+        <w:t xml:space="preserve">Diseno de la experiencia de usuario.</w:t>
+      </w:r>
     </w:p>
     <w:p>
       <w:pPr>
@@ -4045,7 +4022,7 @@
           <w:sz w:val="24"/>
           <w:szCs w:val="24"/>
         </w:rPr>
-        <w:t xml:space="preserve">Desarrollo de la interfaz grafica.</w:t>
+        <w:t xml:space="preserve">Implementacion de componentes visuales.</w:t>
       </w:r>
     </w:p>
     <w:p>
@@ -4064,8 +4041,26 @@
           <w:sz w:val="24"/>
           <w:szCs w:val="24"/>
         </w:rPr>
-        <w:t xml:space="preserve">Diseno de la experiencia de usuario.</w:t>
-      </w:r>
+        <w:t xml:space="preserve">Tratamiento de la expiracion de sesion en pantalla y mejoras de accesibilidad por teclado.</w:t>
+      </w:r>
+    </w:p>
+    <w:p>
+      <w:pPr>
+        <w:pStyle w:val="Heading2"/>
+        <w:spacing w:after="120" w:before="240" w:line="480"/>
+      </w:pPr>
+      <w:bookmarkStart w:name="_Toc15" w:id="15"/>
+      <w:r>
+        <w:rPr>
+          <w:rFonts w:ascii="Times New Roman" w:cs="Times New Roman" w:eastAsia="Times New Roman" w:hAnsi="Times New Roman"/>
+          <w:b/>
+          <w:bCs/>
+          <w:sz w:val="24"/>
+          <w:szCs w:val="24"/>
+        </w:rPr>
+        <w:t xml:space="preserve">10.2. Elian Cavenatti</w:t>
+      </w:r>
+      <w:bookmarkEnd w:id="15"/>
     </w:p>
     <w:p>
       <w:pPr>
@@ -4083,7 +4078,7 @@
           <w:sz w:val="24"/>
           <w:szCs w:val="24"/>
         </w:rPr>
-        <w:t xml:space="preserve">Implementacion de componentes visuales.</w:t>
+        <w:t xml:space="preserve">Desarrollo de funcionalidades tanto del frontend como del backend.</w:t>
       </w:r>
     </w:p>
     <w:p>
@@ -4102,26 +4097,8 @@
           <w:sz w:val="24"/>
           <w:szCs w:val="24"/>
         </w:rPr>
-        <w:t xml:space="preserve">Tratamiento de la expiracion de sesion en pantalla y mejoras de accesibilidad por teclado.</w:t>
-      </w:r>
-    </w:p>
-    <w:p>
-      <w:pPr>
-        <w:pStyle w:val="Heading2"/>
-        <w:spacing w:after="120" w:before="240" w:line="480"/>
-      </w:pPr>
-      <w:bookmarkStart w:name="_Toc15" w:id="15"/>
-      <w:r>
-        <w:rPr>
-          <w:rFonts w:ascii="Times New Roman" w:cs="Times New Roman" w:eastAsia="Times New Roman" w:hAnsi="Times New Roman"/>
-          <w:b/>
-          <w:bCs/>
-          <w:sz w:val="24"/>
-          <w:szCs w:val="24"/>
-        </w:rPr>
-        <w:t xml:space="preserve">10.2. Elian Cavenatti</w:t>
-      </w:r>
-      <w:bookmarkEnd w:id="15"/>
+        <w:t xml:space="preserve">Integracion entre la interfaz y la base de datos.</w:t>
+      </w:r>
     </w:p>
     <w:p>
       <w:pPr>
@@ -4139,7 +4116,7 @@
           <w:sz w:val="24"/>
           <w:szCs w:val="24"/>
         </w:rPr>
-        <w:t xml:space="preserve">Desarrollo de funcionalidades tanto del frontend como del backend.</w:t>
+        <w:t xml:space="preserve">Correccion de incidencias detectadas durante el desarrollo.</w:t>
       </w:r>
     </w:p>
     <w:p>
@@ -4158,8 +4135,26 @@
           <w:sz w:val="24"/>
           <w:szCs w:val="24"/>
         </w:rPr>
-        <w:t xml:space="preserve">Integracion entre la interfaz y la base de datos.</w:t>
-      </w:r>
+        <w:t xml:space="preserve">Refuerzo de la seguridad del inicio de sesion y correccion del defecto de desfasaje horario entre la aplicacion y la base de datos.</w:t>
+      </w:r>
+    </w:p>
+    <w:p>
+      <w:pPr>
+        <w:pStyle w:val="Heading2"/>
+        <w:spacing w:after="120" w:before="240" w:line="480"/>
+      </w:pPr>
+      <w:bookmarkStart w:name="_Toc16" w:id="16"/>
+      <w:r>
+        <w:rPr>
+          <w:rFonts w:ascii="Times New Roman" w:cs="Times New Roman" w:eastAsia="Times New Roman" w:hAnsi="Times New Roman"/>
+          <w:b/>
+          <w:bCs/>
+          <w:sz w:val="24"/>
+          <w:szCs w:val="24"/>
+        </w:rPr>
+        <w:t xml:space="preserve">10.3. Leonardo Vertali</w:t>
+      </w:r>
+      <w:bookmarkEnd w:id="16"/>
     </w:p>
     <w:p>
       <w:pPr>
@@ -4177,7 +4172,7 @@
           <w:sz w:val="24"/>
           <w:szCs w:val="24"/>
         </w:rPr>
-        <w:t xml:space="preserve">Correccion de incidencias detectadas durante el desarrollo.</w:t>
+        <w:t xml:space="preserve">Diseno de la base de datos.</w:t>
       </w:r>
     </w:p>
     <w:p>
@@ -4196,26 +4191,8 @@
           <w:sz w:val="24"/>
           <w:szCs w:val="24"/>
         </w:rPr>
-        <w:t xml:space="preserve">Refuerzo de la seguridad del inicio de sesion y correccion del defecto de desfasaje horario entre la aplicacion y la base de datos.</w:t>
-      </w:r>
-    </w:p>
-    <w:p>
-      <w:pPr>
-        <w:pStyle w:val="Heading2"/>
-        <w:spacing w:after="120" w:before="240" w:line="480"/>
-      </w:pPr>
-      <w:bookmarkStart w:name="_Toc16" w:id="16"/>
-      <w:r>
-        <w:rPr>
-          <w:rFonts w:ascii="Times New Roman" w:cs="Times New Roman" w:eastAsia="Times New Roman" w:hAnsi="Times New Roman"/>
-          <w:b/>
-          <w:bCs/>
-          <w:sz w:val="24"/>
-          <w:szCs w:val="24"/>
-        </w:rPr>
-        <w:t xml:space="preserve">10.3. Leonardo Vertali</w:t>
-      </w:r>
-      <w:bookmarkEnd w:id="16"/>
+        <w:t xml:space="preserve">Elaboracion del modelo de datos y del diagrama entidad-relacion.</w:t>
+      </w:r>
     </w:p>
     <w:p>
       <w:pPr>
@@ -4233,7 +4210,7 @@
           <w:sz w:val="24"/>
           <w:szCs w:val="24"/>
         </w:rPr>
-        <w:t xml:space="preserve">Diseno de la base de datos.</w:t>
+        <w:t xml:space="preserve">Implementacion del esquema, el procedimiento almacenado de bajas y las vistas analiticas.</w:t>
       </w:r>
     </w:p>
     <w:p>
@@ -4252,8 +4229,26 @@
           <w:sz w:val="24"/>
           <w:szCs w:val="24"/>
         </w:rPr>
-        <w:t xml:space="preserve">Elaboracion del modelo de datos y del diagrama entidad-relacion.</w:t>
-      </w:r>
+        <w:t xml:space="preserve">Unificacion del esquema en un unico script de creacion.</w:t>
+      </w:r>
+    </w:p>
+    <w:p>
+      <w:pPr>
+        <w:pStyle w:val="Heading2"/>
+        <w:spacing w:after="120" w:before="240" w:line="480"/>
+      </w:pPr>
+      <w:bookmarkStart w:name="_Toc17" w:id="17"/>
+      <w:r>
+        <w:rPr>
+          <w:rFonts w:ascii="Times New Roman" w:cs="Times New Roman" w:eastAsia="Times New Roman" w:hAnsi="Times New Roman"/>
+          <w:b/>
+          <w:bCs/>
+          <w:sz w:val="24"/>
+          <w:szCs w:val="24"/>
+        </w:rPr>
+        <w:t xml:space="preserve">10.4. Aaron Brumat</w:t>
+      </w:r>
+      <w:bookmarkEnd w:id="17"/>
     </w:p>
     <w:p>
       <w:pPr>
@@ -4271,7 +4266,7 @@
           <w:sz w:val="24"/>
           <w:szCs w:val="24"/>
         </w:rPr>
-        <w:t xml:space="preserve">Implementacion del esquema, el procedimiento almacenado de bajas y las vistas analiticas.</w:t>
+        <w:t xml:space="preserve">Elaboracion del plan de pruebas funcionales y de los casos de prueba por requerimiento.</w:t>
       </w:r>
     </w:p>
     <w:p>
@@ -4290,26 +4285,8 @@
           <w:sz w:val="24"/>
           <w:szCs w:val="24"/>
         </w:rPr>
-        <w:t xml:space="preserve">Unificacion del esquema en un unico script de creacion.</w:t>
-      </w:r>
-    </w:p>
-    <w:p>
-      <w:pPr>
-        <w:pStyle w:val="Heading2"/>
-        <w:spacing w:after="120" w:before="240" w:line="480"/>
-      </w:pPr>
-      <w:bookmarkStart w:name="_Toc17" w:id="17"/>
-      <w:r>
-        <w:rPr>
-          <w:rFonts w:ascii="Times New Roman" w:cs="Times New Roman" w:eastAsia="Times New Roman" w:hAnsi="Times New Roman"/>
-          <w:b/>
-          <w:bCs/>
-          <w:sz w:val="24"/>
-          <w:szCs w:val="24"/>
-        </w:rPr>
-        <w:t xml:space="preserve">10.4. Aaron Brumat</w:t>
-      </w:r>
-      <w:bookmarkEnd w:id="17"/>
+        <w:t xml:space="preserve">Ejecucion de las pruebas manuales y registro de los defectos detectados.</w:t>
+      </w:r>
     </w:p>
     <w:p>
       <w:pPr>
@@ -4327,7 +4304,7 @@
           <w:sz w:val="24"/>
           <w:szCs w:val="24"/>
         </w:rPr>
-        <w:t xml:space="preserve">Elaboracion del plan de pruebas funcionales y de los casos de prueba por requerimiento.</w:t>
+        <w:t xml:space="preserve">Automatizacion de los casos criticos del plan de pruebas.</w:t>
       </w:r>
     </w:p>
     <w:p>
@@ -4346,7 +4323,7 @@
           <w:sz w:val="24"/>
           <w:szCs w:val="24"/>
         </w:rPr>
-        <w:t xml:space="preserve">Ejecucion de las pruebas manuales y registro de los defectos detectados.</w:t>
+        <w:t xml:space="preserve">Configuracion de la integracion continua.</w:t>
       </w:r>
     </w:p>
     <w:p>
@@ -4365,7 +4342,7 @@
           <w:sz w:val="24"/>
           <w:szCs w:val="24"/>
         </w:rPr>
-        <w:t xml:space="preserve">Automatizacion de los casos criticos del plan de pruebas.</w:t>
+        <w:t xml:space="preserve">Redaccion de la documentacion tecnica y funcional del proyecto.</w:t>
       </w:r>
     </w:p>
     <w:p>
@@ -4384,45 +4361,7 @@
           <w:sz w:val="24"/>
           <w:szCs w:val="24"/>
         </w:rPr>
-        <w:t xml:space="preserve">Configuracion de la integracion continua.</w:t>
-      </w:r>
-    </w:p>
-    <w:p>
-      <w:pPr>
-        <w:pStyle w:val="ListParagraph"/>
-        <w:numPr>
-          <w:ilvl w:val="0"/>
-          <w:numId w:val="2"/>
-        </w:numPr>
-        <w:spacing w:after="0" w:line="480"/>
-        <w:jc w:val="both"/>
-      </w:pPr>
-      <w:r>
-        <w:rPr>
-          <w:rFonts w:ascii="Times New Roman" w:cs="Times New Roman" w:eastAsia="Times New Roman" w:hAnsi="Times New Roman"/>
-          <w:sz w:val="24"/>
-          <w:szCs w:val="24"/>
-        </w:rPr>
-        <w:t xml:space="preserve">Redaccion de la documentacion tecnica y funcional del proyecto.</w:t>
-      </w:r>
-    </w:p>
-    <w:p>
-      <w:pPr>
-        <w:pStyle w:val="ListParagraph"/>
-        <w:numPr>
-          <w:ilvl w:val="0"/>
-          <w:numId w:val="2"/>
-        </w:numPr>
-        <w:spacing w:after="0" w:line="480"/>
-        <w:jc w:val="both"/>
-      </w:pPr>
-      <w:r>
-        <w:rPr>
-          <w:rFonts w:ascii="Times New Roman" w:cs="Times New Roman" w:eastAsia="Times New Roman" w:hAnsi="Times New Roman"/>
-          <w:sz w:val="24"/>
-          <w:szCs w:val="24"/>
-        </w:rPr>
-        <w:t xml:space="preserve">Publicacion del sistema en el entorno de demostracion.</w:t>
+        <w:t xml:space="preserve">Preparacion del entorno de demostracion del sistema.</w:t>
       </w:r>
     </w:p>
     <w:p>
@@ -11640,7 +11579,7 @@
                 <w:sz w:val="20"/>
                 <w:szCs w:val="20"/>
               </w:rPr>
-              <w:t xml:space="preserve">Prepara la publicacion del sistema como sitio privado en un solo dominio, con usuario y contrasena para todo el sitio y sin que quede indexado por buscadores.</w:t>
+              <w:t xml:space="preserve">Prepara el entorno de demostracion: que el sistema pueda ejecutarse sin un servidor de base de datos, siempre desde el mismo juego de datos, y que la interfaz avise en pantalla cuando corre en ese modo para que la condicion no quede oculta.</w:t>
             </w:r>
           </w:p>
         </w:tc>
@@ -11667,7 +11606,227 @@
                 <w:sz w:val="20"/>
                 <w:szCs w:val="20"/>
               </w:rPr>
-              <w:t xml:space="preserve">Configuracion de publicacion descrita en la seccion 36.</w:t>
+              <w:t xml:space="preserve">Entorno de demostracion descrito en la seccion 36, con el aviso de modo en la interfaz.</w:t>
+            </w:r>
+          </w:p>
+        </w:tc>
+      </w:tr>
+      <w:tr>
+        <w:tc>
+          <w:tcPr>
+            <w:tcW w:type="dxa" w:w="936"/>
+            <w:tcMar>
+              <w:top w:type="dxa" w:w="60"/>
+              <w:left w:type="dxa" w:w="100"/>
+              <w:bottom w:type="dxa" w:w="60"/>
+              <w:right w:type="dxa" w:w="100"/>
+            </w:tcMar>
+          </w:tcPr>
+          <w:p>
+            <w:pPr>
+              <w:spacing w:after="20" w:before="20" w:line="240"/>
+              <w:jc w:val="left"/>
+            </w:pPr>
+            <w:r>
+              <w:rPr>
+                <w:rFonts w:ascii="Times New Roman" w:cs="Times New Roman" w:eastAsia="Times New Roman" w:hAnsi="Times New Roman"/>
+                <w:b w:val="false"/>
+                <w:bCs w:val="false"/>
+                <w:sz w:val="20"/>
+                <w:szCs w:val="20"/>
+              </w:rPr>
+              <w:t xml:space="preserve">9c2f048</w:t>
+            </w:r>
+          </w:p>
+        </w:tc>
+        <w:tc>
+          <w:tcPr>
+            <w:tcW w:type="dxa" w:w="1123"/>
+            <w:tcMar>
+              <w:top w:type="dxa" w:w="60"/>
+              <w:left w:type="dxa" w:w="100"/>
+              <w:bottom w:type="dxa" w:w="60"/>
+              <w:right w:type="dxa" w:w="100"/>
+            </w:tcMar>
+          </w:tcPr>
+          <w:p>
+            <w:pPr>
+              <w:spacing w:after="20" w:before="20" w:line="240"/>
+              <w:jc w:val="left"/>
+            </w:pPr>
+            <w:r>
+              <w:rPr>
+                <w:rFonts w:ascii="Times New Roman" w:cs="Times New Roman" w:eastAsia="Times New Roman" w:hAnsi="Times New Roman"/>
+                <w:b w:val="false"/>
+                <w:bCs w:val="false"/>
+                <w:sz w:val="20"/>
+                <w:szCs w:val="20"/>
+              </w:rPr>
+              <w:t xml:space="preserve">13/10/2026</w:t>
+            </w:r>
+          </w:p>
+        </w:tc>
+        <w:tc>
+          <w:tcPr>
+            <w:tcW w:type="dxa" w:w="4118"/>
+            <w:tcMar>
+              <w:top w:type="dxa" w:w="60"/>
+              <w:left w:type="dxa" w:w="100"/>
+              <w:bottom w:type="dxa" w:w="60"/>
+              <w:right w:type="dxa" w:w="100"/>
+            </w:tcMar>
+          </w:tcPr>
+          <w:p>
+            <w:pPr>
+              <w:spacing w:after="20" w:before="20" w:line="240"/>
+              <w:jc w:val="left"/>
+            </w:pPr>
+            <w:r>
+              <w:rPr>
+                <w:rFonts w:ascii="Times New Roman" w:cs="Times New Roman" w:eastAsia="Times New Roman" w:hAnsi="Times New Roman"/>
+                <w:b w:val="false"/>
+                <w:bCs w:val="false"/>
+                <w:sz w:val="20"/>
+                <w:szCs w:val="20"/>
+              </w:rPr>
+              <w:t xml:space="preserve">Arma el documento de entrega final con las secciones que pide la consigna, respetando normas APA: caratula, indice automatico, tablas con titulo y nota, y referencias con sangria francesa.</w:t>
+            </w:r>
+          </w:p>
+        </w:tc>
+        <w:tc>
+          <w:tcPr>
+            <w:tcW w:type="dxa" w:w="3183"/>
+            <w:tcMar>
+              <w:top w:type="dxa" w:w="60"/>
+              <w:left w:type="dxa" w:w="100"/>
+              <w:bottom w:type="dxa" w:w="60"/>
+              <w:right w:type="dxa" w:w="100"/>
+            </w:tcMar>
+          </w:tcPr>
+          <w:p>
+            <w:pPr>
+              <w:spacing w:after="20" w:before="20" w:line="240"/>
+              <w:jc w:val="left"/>
+            </w:pPr>
+            <w:r>
+              <w:rPr>
+                <w:rFonts w:ascii="Times New Roman" w:cs="Times New Roman" w:eastAsia="Times New Roman" w:hAnsi="Times New Roman"/>
+                <w:b w:val="false"/>
+                <w:bCs w:val="false"/>
+                <w:sz w:val="20"/>
+                <w:szCs w:val="20"/>
+              </w:rPr>
+              <w:t xml:space="preserve">Documento de entrega final, en formato editable y en PDF.</w:t>
+            </w:r>
+          </w:p>
+        </w:tc>
+      </w:tr>
+      <w:tr>
+        <w:tc>
+          <w:tcPr>
+            <w:tcW w:type="dxa" w:w="936"/>
+            <w:tcMar>
+              <w:top w:type="dxa" w:w="60"/>
+              <w:left w:type="dxa" w:w="100"/>
+              <w:bottom w:type="dxa" w:w="60"/>
+              <w:right w:type="dxa" w:w="100"/>
+            </w:tcMar>
+          </w:tcPr>
+          <w:p>
+            <w:pPr>
+              <w:spacing w:after="20" w:before="20" w:line="240"/>
+              <w:jc w:val="left"/>
+            </w:pPr>
+            <w:r>
+              <w:rPr>
+                <w:rFonts w:ascii="Times New Roman" w:cs="Times New Roman" w:eastAsia="Times New Roman" w:hAnsi="Times New Roman"/>
+                <w:b w:val="false"/>
+                <w:bCs w:val="false"/>
+                <w:sz w:val="20"/>
+                <w:szCs w:val="20"/>
+              </w:rPr>
+              <w:t xml:space="preserve">b3b5f7e</w:t>
+            </w:r>
+          </w:p>
+        </w:tc>
+        <w:tc>
+          <w:tcPr>
+            <w:tcW w:type="dxa" w:w="1123"/>
+            <w:tcMar>
+              <w:top w:type="dxa" w:w="60"/>
+              <w:left w:type="dxa" w:w="100"/>
+              <w:bottom w:type="dxa" w:w="60"/>
+              <w:right w:type="dxa" w:w="100"/>
+            </w:tcMar>
+          </w:tcPr>
+          <w:p>
+            <w:pPr>
+              <w:spacing w:after="20" w:before="20" w:line="240"/>
+              <w:jc w:val="left"/>
+            </w:pPr>
+            <w:r>
+              <w:rPr>
+                <w:rFonts w:ascii="Times New Roman" w:cs="Times New Roman" w:eastAsia="Times New Roman" w:hAnsi="Times New Roman"/>
+                <w:b w:val="false"/>
+                <w:bCs w:val="false"/>
+                <w:sz w:val="20"/>
+                <w:szCs w:val="20"/>
+              </w:rPr>
+              <w:t xml:space="preserve">15/10/2026</w:t>
+            </w:r>
+          </w:p>
+        </w:tc>
+        <w:tc>
+          <w:tcPr>
+            <w:tcW w:type="dxa" w:w="4118"/>
+            <w:tcMar>
+              <w:top w:type="dxa" w:w="60"/>
+              <w:left w:type="dxa" w:w="100"/>
+              <w:bottom w:type="dxa" w:w="60"/>
+              <w:right w:type="dxa" w:w="100"/>
+            </w:tcMar>
+          </w:tcPr>
+          <w:p>
+            <w:pPr>
+              <w:spacing w:after="20" w:before="20" w:line="240"/>
+              <w:jc w:val="left"/>
+            </w:pPr>
+            <w:r>
+              <w:rPr>
+                <w:rFonts w:ascii="Times New Roman" w:cs="Times New Roman" w:eastAsia="Times New Roman" w:hAnsi="Times New Roman"/>
+                <w:b w:val="false"/>
+                <w:bCs w:val="false"/>
+                <w:sz w:val="20"/>
+                <w:szCs w:val="20"/>
+              </w:rPr>
+              <w:t xml:space="preserve">Las ventas se guardan con NOW() del servidor de MySQL y los periodos de los reportes se calculan con la fecha local del proceso. Hay que alinear la zona horaria de cada conexion del pool usando el evento de conexion, y no una sola vez al arrancar.</w:t>
+            </w:r>
+          </w:p>
+        </w:tc>
+        <w:tc>
+          <w:tcPr>
+            <w:tcW w:type="dxa" w:w="3183"/>
+            <w:tcMar>
+              <w:top w:type="dxa" w:w="60"/>
+              <w:left w:type="dxa" w:w="100"/>
+              <w:bottom w:type="dxa" w:w="60"/>
+              <w:right w:type="dxa" w:w="100"/>
+            </w:tcMar>
+          </w:tcPr>
+          <w:p>
+            <w:pPr>
+              <w:spacing w:after="20" w:before="20" w:line="240"/>
+              <w:jc w:val="left"/>
+            </w:pPr>
+            <w:r>
+              <w:rPr>
+                <w:rFonts w:ascii="Times New Roman" w:cs="Times New Roman" w:eastAsia="Times New Roman" w:hAnsi="Times New Roman"/>
+                <w:b w:val="false"/>
+                <w:bCs w:val="false"/>
+                <w:sz w:val="20"/>
+                <w:szCs w:val="20"/>
+              </w:rPr>
+              <w:t xml:space="preserve">Cierre del defecto DEF-003, de severidad alta, con la verificacion que detalla la seccion 34.</w:t>
             </w:r>
           </w:p>
         </w:tc>
@@ -12825,7 +12984,7 @@
           <w:sz w:val="24"/>
           <w:szCs w:val="24"/>
         </w:rPr>
-        <w:t xml:space="preserve">20.4. Elian Cavenatti. Tickets KIO-01 y KIO-02</w:t>
+        <w:t xml:space="preserve">20.4. Refuerzo de la seguridad del inicio de sesion. Ticket KIO-01</w:t>
       </w:r>
       <w:bookmarkEnd w:id="48"/>
     </w:p>
@@ -12841,7 +13000,7 @@
           <w:sz w:val="24"/>
           <w:szCs w:val="24"/>
         </w:rPr>
-        <w:t xml:space="preserve">Los commits de este integrante corresponden a las correcciones de seguridad y de integracion con la base de datos derivadas de la auditoria interna descrita en la seccion 34. Los identificadores abreviados deben completarse con los del historial una vez incorporados a la rama principal.</w:t>
+        <w:t xml:space="preserve">Esta serie de commits corresponde al hallazgo de seguridad descrito en la seccion 34 y fue incorporada por Lucas Beim sobre la rama del ticket KIO-01.</w:t>
       </w:r>
     </w:p>
     <w:p>
@@ -12871,7 +13030,7 @@
           <w:sz w:val="24"/>
           <w:szCs w:val="24"/>
         </w:rPr>
-        <w:t xml:space="preserve">Registro de prompts de Elian Cavenatti</w:t>
+        <w:t xml:space="preserve">Registro de prompts del refuerzo de seguridad</w:t>
       </w:r>
     </w:p>
     <w:tbl>
@@ -12948,7 +13107,7 @@
                 <w:sz w:val="20"/>
                 <w:szCs w:val="20"/>
               </w:rPr>
-              <w:t xml:space="preserve">Ticket</w:t>
+              <w:t xml:space="preserve">Fecha</w:t>
             </w:r>
           </w:p>
         </w:tc>
@@ -13033,7 +13192,7 @@
                 <w:sz w:val="20"/>
                 <w:szCs w:val="20"/>
               </w:rPr>
-              <w:t xml:space="preserve">(completar)</w:t>
+              <w:t xml:space="preserve">65f7ad4</w:t>
             </w:r>
           </w:p>
         </w:tc>
@@ -13060,7 +13219,7 @@
                 <w:sz w:val="20"/>
                 <w:szCs w:val="20"/>
               </w:rPr>
-              <w:t xml:space="preserve">KIO-01</w:t>
+              <w:t xml:space="preserve">15/10/2026</w:t>
             </w:r>
           </w:p>
         </w:tc>
@@ -13087,7 +13246,7 @@
                 <w:sz w:val="20"/>
                 <w:szCs w:val="20"/>
               </w:rPr>
-              <w:t xml:space="preserve">Necesito que en produccion el servidor se niegue a arrancar si el secreto de sesion falta, tiene menos de 32 caracteres o es un valor de relleno conocido. En desarrollo se debe permitir el valor por defecto. La validacion debe recibir el secreto y el entorno por parametro para poder probarla.</w:t>
+              <w:t xml:space="preserve">No hay limite de intentos de inicio de sesion: se pueden probar contrasenas de forma indefinida. Quiero un middleware con una ventana deslizante de cinco intentos fallidos por cuenta cada quince minutos, que responda con el codigo 429 e indique en cuantos minutos se puede volver a intentar, y engancharlo en la ruta de ingreso.</w:t>
             </w:r>
           </w:p>
         </w:tc>
@@ -13114,7 +13273,7 @@
                 <w:sz w:val="20"/>
                 <w:szCs w:val="20"/>
               </w:rPr>
-              <w:t xml:space="preserve">Validacion del secreto de sesion en el arranque, con seis pruebas automatizadas que cubren el caso de desarrollo, el de produccion y los valores de relleno.</w:t>
+              <w:t xml:space="preserve">Middleware de limite de intentos de ingreso, enganchado en la ruta de inicio de sesion, con el ajuste de configuracion de entorno que requiere.</w:t>
             </w:r>
           </w:p>
         </w:tc>
@@ -13143,7 +13302,7 @@
                 <w:sz w:val="20"/>
                 <w:szCs w:val="20"/>
               </w:rPr>
-              <w:t xml:space="preserve">(completar)</w:t>
+              <w:t xml:space="preserve">3ab41cd</w:t>
             </w:r>
           </w:p>
         </w:tc>
@@ -13170,7 +13329,7 @@
                 <w:sz w:val="20"/>
                 <w:szCs w:val="20"/>
               </w:rPr>
-              <w:t xml:space="preserve">KIO-01</w:t>
+              <w:t xml:space="preserve">15/10/2026</w:t>
             </w:r>
           </w:p>
         </w:tc>
@@ -13197,7 +13356,7 @@
                 <w:sz w:val="20"/>
                 <w:szCs w:val="20"/>
               </w:rPr>
-              <w:t xml:space="preserve">Quiero un middleware con una ventana deslizante de 5 intentos fallidos de inicio de sesion por email cada 15 minutos. El sexto intento responde 429 con un mensaje que diga en cuantos minutos puede volver a intentar. Un ingreso correcto libera la cuenta.</w:t>
+              <w:t xml:space="preserve">Revisa la configuracion de la conexion a la base de datos: quedo un valor mal despues de integrar el middleware.</w:t>
             </w:r>
           </w:p>
         </w:tc>
@@ -13224,7 +13383,7 @@
                 <w:sz w:val="20"/>
                 <w:szCs w:val="20"/>
               </w:rPr>
-              <w:t xml:space="preserve">Limite de intentos de inicio de sesion por email, con cinco pruebas automatizadas que verifican el bloqueo, su alcance por cuenta y su liberacion.</w:t>
+              <w:t xml:space="preserve">Correccion de la configuracion de la conexion.</w:t>
             </w:r>
           </w:p>
         </w:tc>
@@ -13253,7 +13412,7 @@
                 <w:sz w:val="20"/>
                 <w:szCs w:val="20"/>
               </w:rPr>
-              <w:t xml:space="preserve">(completar)</w:t>
+              <w:t xml:space="preserve">c68cd84</w:t>
             </w:r>
           </w:p>
         </w:tc>
@@ -13280,7 +13439,7 @@
                 <w:sz w:val="20"/>
                 <w:szCs w:val="20"/>
               </w:rPr>
-              <w:t xml:space="preserve">KIO-02</w:t>
+              <w:t xml:space="preserve">15/10/2026</w:t>
             </w:r>
           </w:p>
         </w:tc>
@@ -13307,7 +13466,7 @@
                 <w:sz w:val="20"/>
                 <w:szCs w:val="20"/>
               </w:rPr>
-              <w:t xml:space="preserve">La API responde 401 tanto cuando el token vencio como cuando la contrasena es incorrecta, y el frontend no puede distinguirlos. Necesito un codigo de error propio para la sesion vencida. Ademas, las ventas se guardan con el reloj de MySQL y los reportes se calculan con el de la aplicacion: hay que alinear la zona horaria de cada conexion del pool.</w:t>
+              <w:t xml:space="preserve">Queda un error en la configuracion de la conexion a la base de datos despues del cambio anterior. Corregilo.</w:t>
             </w:r>
           </w:p>
         </w:tc>
@@ -13334,7 +13493,7 @@
                 <w:sz w:val="20"/>
                 <w:szCs w:val="20"/>
               </w:rPr>
-              <w:t xml:space="preserve">Codigo de error propio para la sesion vencida, que habilita el aviso en pantalla del ticket KIO-06, y correccion del defecto DEF-003.</w:t>
+              <w:t xml:space="preserve">Ajuste final de la configuracion de la conexion.</w:t>
             </w:r>
           </w:p>
         </w:tc>
@@ -25542,7 +25701,7 @@
                 <w:sz w:val="20"/>
                 <w:szCs w:val="20"/>
               </w:rPr>
-              <w:t xml:space="preserve">Integracion final, documentacion, publicacion y presentacion.</w:t>
+              <w:t xml:space="preserve">Integracion final, documentacion y presentacion del sistema en funcionamiento.</w:t>
             </w:r>
           </w:p>
         </w:tc>
@@ -25596,7 +25755,7 @@
                 <w:sz w:val="20"/>
                 <w:szCs w:val="20"/>
               </w:rPr>
-              <w:t xml:space="preserve">Sistema publicado y documento final.</w:t>
+              <w:t xml:space="preserve">Sistema terminado y documento final.</w:t>
             </w:r>
           </w:p>
         </w:tc>
@@ -27645,7 +27804,7 @@
                 <w:sz w:val="20"/>
                 <w:szCs w:val="20"/>
               </w:rPr>
-              <w:t xml:space="preserve">Publicacion y documentacion final</w:t>
+              <w:t xml:space="preserve">Documentacion final y entrega</w:t>
             </w:r>
           </w:p>
         </w:tc>
@@ -29684,35 +29843,6 @@
     </w:p>
     <w:p>
       <w:pPr>
-        <w:pStyle w:val="ListParagraph"/>
-        <w:numPr>
-          <w:ilvl w:val="0"/>
-          <w:numId w:val="3"/>
-        </w:numPr>
-        <w:spacing w:after="0" w:line="480"/>
-        <w:jc w:val="both"/>
-      </w:pPr>
-      <w:r>
-        <w:rPr>
-          <w:rFonts w:ascii="Times New Roman" w:cs="Times New Roman" w:eastAsia="Times New Roman" w:hAnsi="Times New Roman"/>
-          <w:b/>
-          <w:bCs/>
-          <w:sz w:val="24"/>
-          <w:szCs w:val="24"/>
-        </w:rPr>
-        <w:t xml:space="preserve">Pruebas de seguridad de la sesion.</w:t>
-      </w:r>
-      <w:r>
-        <w:rPr>
-          <w:rFonts w:ascii="Times New Roman" w:cs="Times New Roman" w:eastAsia="Times New Roman" w:hAnsi="Times New Roman"/>
-          <w:sz w:val="24"/>
-          <w:szCs w:val="24"/>
-        </w:rPr>
-        <w:t xml:space="preserve"> Verificacion del secreto de sesion, del limite de intentos de ingreso y de la distincion entre sesion vencida y credenciales incorrectas.</w:t>
-      </w:r>
-    </w:p>
-    <w:p>
-      <w:pPr>
         <w:pStyle w:val="Heading2"/>
         <w:spacing w:after="120" w:before="240" w:line="480"/>
       </w:pPr>
@@ -32753,7 +32883,7 @@
           <w:sz w:val="24"/>
           <w:szCs w:val="24"/>
         </w:rPr>
-        <w:t xml:space="preserve">Los casos criticos del plan fueron automatizados para poder ejecutarlos en cualquier momento y en cada cambio. La suite consta de 78 pruebas y se ejecuta, en una computadora de escritorio, en menos de un segundo.</w:t>
+        <w:t xml:space="preserve">Los casos criticos del plan fueron automatizados para poder ejecutarlos en cualquier momento y en cada cambio. La suite consta de 65 pruebas y se ejecuta, en una computadora de escritorio, en menos de un segundo.</w:t>
       </w:r>
     </w:p>
     <w:p>
@@ -33239,89 +33369,6 @@
           </w:p>
         </w:tc>
       </w:tr>
-      <w:tr>
-        <w:tc>
-          <w:tcPr>
-            <w:tcW w:type="dxa" w:w="2621"/>
-            <w:tcMar>
-              <w:top w:type="dxa" w:w="60"/>
-              <w:left w:type="dxa" w:w="100"/>
-              <w:bottom w:type="dxa" w:w="60"/>
-              <w:right w:type="dxa" w:w="100"/>
-            </w:tcMar>
-          </w:tcPr>
-          <w:p>
-            <w:pPr>
-              <w:spacing w:after="20" w:before="20" w:line="240"/>
-              <w:jc w:val="left"/>
-            </w:pPr>
-            <w:r>
-              <w:rPr>
-                <w:rFonts w:ascii="Times New Roman" w:cs="Times New Roman" w:eastAsia="Times New Roman" w:hAnsi="Times New Roman"/>
-                <w:b w:val="false"/>
-                <w:bCs w:val="false"/>
-                <w:sz w:val="20"/>
-                <w:szCs w:val="20"/>
-              </w:rPr>
-              <w:t xml:space="preserve">Seguridad de la sesion</w:t>
-            </w:r>
-          </w:p>
-        </w:tc>
-        <w:tc>
-          <w:tcPr>
-            <w:tcW w:type="dxa" w:w="1123"/>
-            <w:tcMar>
-              <w:top w:type="dxa" w:w="60"/>
-              <w:left w:type="dxa" w:w="100"/>
-              <w:bottom w:type="dxa" w:w="60"/>
-              <w:right w:type="dxa" w:w="100"/>
-            </w:tcMar>
-          </w:tcPr>
-          <w:p>
-            <w:pPr>
-              <w:spacing w:after="20" w:before="20" w:line="240"/>
-              <w:jc w:val="left"/>
-            </w:pPr>
-            <w:r>
-              <w:rPr>
-                <w:rFonts w:ascii="Times New Roman" w:cs="Times New Roman" w:eastAsia="Times New Roman" w:hAnsi="Times New Roman"/>
-                <w:b w:val="false"/>
-                <w:bCs w:val="false"/>
-                <w:sz w:val="20"/>
-                <w:szCs w:val="20"/>
-              </w:rPr>
-              <w:t xml:space="preserve">13</w:t>
-            </w:r>
-          </w:p>
-        </w:tc>
-        <w:tc>
-          <w:tcPr>
-            <w:tcW w:type="dxa" w:w="5616"/>
-            <w:tcMar>
-              <w:top w:type="dxa" w:w="60"/>
-              <w:left w:type="dxa" w:w="100"/>
-              <w:bottom w:type="dxa" w:w="60"/>
-              <w:right w:type="dxa" w:w="100"/>
-            </w:tcMar>
-          </w:tcPr>
-          <w:p>
-            <w:pPr>
-              <w:spacing w:after="20" w:before="20" w:line="240"/>
-              <w:jc w:val="left"/>
-            </w:pPr>
-            <w:r>
-              <w:rPr>
-                <w:rFonts w:ascii="Times New Roman" w:cs="Times New Roman" w:eastAsia="Times New Roman" w:hAnsi="Times New Roman"/>
-                <w:b w:val="false"/>
-                <w:bCs w:val="false"/>
-                <w:sz w:val="20"/>
-                <w:szCs w:val="20"/>
-              </w:rPr>
-              <w:t xml:space="preserve">Validacion del secreto de sesion, limite de intentos de ingreso por cuenta y distincion entre sesion vencida y credenciales incorrectas.</w:t>
-            </w:r>
-          </w:p>
-        </w:tc>
-      </w:tr>
     </w:tbl>
     <w:p>
       <w:pPr>
@@ -33343,7 +33390,7 @@
           <w:sz w:val="20"/>
           <w:szCs w:val="20"/>
         </w:rPr>
-        <w:t xml:space="preserve">Las 13 pruebas de seguridad de la sesion corresponden a los tickets KIO-01 y KIO-02, y se incorporan junto con las correcciones descritas en la seccion 34.</w:t>
+        <w:t xml:space="preserve">La distribucion no es casual: los conjuntos de ventas y de stock concentran los casos negativos, porque son los que verifican las reglas de integridad que el sistema debe hacer cumplir.</w:t>
       </w:r>
     </w:p>
     <w:p>
@@ -34935,7 +34982,7 @@
                 <w:sz w:val="20"/>
                 <w:szCs w:val="20"/>
               </w:rPr>
-              <w:t xml:space="preserve">Secreto de sesion debil</w:t>
+              <w:t xml:space="preserve">Intentos de ingreso sin limite</w:t>
             </w:r>
           </w:p>
         </w:tc>
@@ -34962,7 +35009,7 @@
                 <w:sz w:val="20"/>
                 <w:szCs w:val="20"/>
               </w:rPr>
-              <w:t xml:space="preserve">El sistema podia arrancar en produccion con el secreto de desarrollo escrito en el repositorio, lo que permitiria a cualquiera que lo leyera firmar sesiones validas.</w:t>
+              <w:t xml:space="preserve">Era posible probar contrasenas de forma indefinida contra la pantalla de ingreso, sin que el sistema opusiera ninguna demora.</w:t>
             </w:r>
           </w:p>
         </w:tc>
@@ -34989,7 +35036,7 @@
                 <w:sz w:val="20"/>
                 <w:szCs w:val="20"/>
               </w:rPr>
-              <w:t xml:space="preserve">El servidor se niega a arrancar en produccion con un secreto ausente, corto o de relleno.</w:t>
+              <w:t xml:space="preserve">Limite de cinco intentos fallidos por cuenta cada quince minutos, aplicado en la ruta de ingreso.</w:t>
             </w:r>
           </w:p>
         </w:tc>
@@ -35018,7 +35065,7 @@
                 <w:sz w:val="20"/>
                 <w:szCs w:val="20"/>
               </w:rPr>
-              <w:t xml:space="preserve">Intentos de ingreso sin limite</w:t>
+              <w:t xml:space="preserve">Columna del modelo sin documentar</w:t>
             </w:r>
           </w:p>
         </w:tc>
@@ -35045,7 +35092,7 @@
                 <w:sz w:val="20"/>
                 <w:szCs w:val="20"/>
               </w:rPr>
-              <w:t xml:space="preserve">Era posible probar contrasenas de forma indefinida contra la pantalla de ingreso.</w:t>
+              <w:t xml:space="preserve">La columna que implementa la baja logica de productos se habia incorporado al esquema durante la implementacion, pero no figuraba en el diccionario de datos, de modo que el documento y la base no coincidian.</w:t>
             </w:r>
           </w:p>
         </w:tc>
@@ -35072,173 +35119,7 @@
                 <w:sz w:val="20"/>
                 <w:szCs w:val="20"/>
               </w:rPr>
-              <w:t xml:space="preserve">Limite de cinco intentos fallidos por cuenta cada quince minutos.</w:t>
-            </w:r>
-          </w:p>
-        </w:tc>
-      </w:tr>
-      <w:tr>
-        <w:tc>
-          <w:tcPr>
-            <w:tcW w:type="dxa" w:w="2434"/>
-            <w:tcMar>
-              <w:top w:type="dxa" w:w="60"/>
-              <w:left w:type="dxa" w:w="100"/>
-              <w:bottom w:type="dxa" w:w="60"/>
-              <w:right w:type="dxa" w:w="100"/>
-            </w:tcMar>
-          </w:tcPr>
-          <w:p>
-            <w:pPr>
-              <w:spacing w:after="20" w:before="20" w:line="240"/>
-              <w:jc w:val="left"/>
-            </w:pPr>
-            <w:r>
-              <w:rPr>
-                <w:rFonts w:ascii="Times New Roman" w:cs="Times New Roman" w:eastAsia="Times New Roman" w:hAnsi="Times New Roman"/>
-                <w:b w:val="false"/>
-                <w:bCs w:val="false"/>
-                <w:sz w:val="20"/>
-                <w:szCs w:val="20"/>
-              </w:rPr>
-              <w:t xml:space="preserve">Sesion vencida indistinguible</w:t>
-            </w:r>
-          </w:p>
-        </w:tc>
-        <w:tc>
-          <w:tcPr>
-            <w:tcW w:type="dxa" w:w="4306"/>
-            <w:tcMar>
-              <w:top w:type="dxa" w:w="60"/>
-              <w:left w:type="dxa" w:w="100"/>
-              <w:bottom w:type="dxa" w:w="60"/>
-              <w:right w:type="dxa" w:w="100"/>
-            </w:tcMar>
-          </w:tcPr>
-          <w:p>
-            <w:pPr>
-              <w:spacing w:after="20" w:before="20" w:line="240"/>
-              <w:jc w:val="left"/>
-            </w:pPr>
-            <w:r>
-              <w:rPr>
-                <w:rFonts w:ascii="Times New Roman" w:cs="Times New Roman" w:eastAsia="Times New Roman" w:hAnsi="Times New Roman"/>
-                <w:b w:val="false"/>
-                <w:bCs w:val="false"/>
-                <w:sz w:val="20"/>
-                <w:szCs w:val="20"/>
-              </w:rPr>
-              <w:t xml:space="preserve">La interfaz de programacion de aplicaciones respondia igual ante un token vencido y ante una contrasena incorrecta, por lo que el frontend no podia dar un aviso adecuado.</w:t>
-            </w:r>
-          </w:p>
-        </w:tc>
-        <w:tc>
-          <w:tcPr>
-            <w:tcW w:type="dxa" w:w="2620"/>
-            <w:tcMar>
-              <w:top w:type="dxa" w:w="60"/>
-              <w:left w:type="dxa" w:w="100"/>
-              <w:bottom w:type="dxa" w:w="60"/>
-              <w:right w:type="dxa" w:w="100"/>
-            </w:tcMar>
-          </w:tcPr>
-          <w:p>
-            <w:pPr>
-              <w:spacing w:after="20" w:before="20" w:line="240"/>
-              <w:jc w:val="left"/>
-            </w:pPr>
-            <w:r>
-              <w:rPr>
-                <w:rFonts w:ascii="Times New Roman" w:cs="Times New Roman" w:eastAsia="Times New Roman" w:hAnsi="Times New Roman"/>
-                <w:b w:val="false"/>
-                <w:bCs w:val="false"/>
-                <w:sz w:val="20"/>
-                <w:szCs w:val="20"/>
-              </w:rPr>
-              <w:t xml:space="preserve">Codigo de error propio para la sesion vencida y aviso en pantalla.</w:t>
-            </w:r>
-          </w:p>
-        </w:tc>
-      </w:tr>
-      <w:tr>
-        <w:tc>
-          <w:tcPr>
-            <w:tcW w:type="dxa" w:w="2434"/>
-            <w:tcMar>
-              <w:top w:type="dxa" w:w="60"/>
-              <w:left w:type="dxa" w:w="100"/>
-              <w:bottom w:type="dxa" w:w="60"/>
-              <w:right w:type="dxa" w:w="100"/>
-            </w:tcMar>
-          </w:tcPr>
-          <w:p>
-            <w:pPr>
-              <w:spacing w:after="20" w:before="20" w:line="240"/>
-              <w:jc w:val="left"/>
-            </w:pPr>
-            <w:r>
-              <w:rPr>
-                <w:rFonts w:ascii="Times New Roman" w:cs="Times New Roman" w:eastAsia="Times New Roman" w:hAnsi="Times New Roman"/>
-                <w:b w:val="false"/>
-                <w:bCs w:val="false"/>
-                <w:sz w:val="20"/>
-                <w:szCs w:val="20"/>
-              </w:rPr>
-              <w:t xml:space="preserve">Dos esquemas de base de datos en paralelo</w:t>
-            </w:r>
-          </w:p>
-        </w:tc>
-        <w:tc>
-          <w:tcPr>
-            <w:tcW w:type="dxa" w:w="4306"/>
-            <w:tcMar>
-              <w:top w:type="dxa" w:w="60"/>
-              <w:left w:type="dxa" w:w="100"/>
-              <w:bottom w:type="dxa" w:w="60"/>
-              <w:right w:type="dxa" w:w="100"/>
-            </w:tcMar>
-          </w:tcPr>
-          <w:p>
-            <w:pPr>
-              <w:spacing w:after="20" w:before="20" w:line="240"/>
-              <w:jc w:val="left"/>
-            </w:pPr>
-            <w:r>
-              <w:rPr>
-                <w:rFonts w:ascii="Times New Roman" w:cs="Times New Roman" w:eastAsia="Times New Roman" w:hAnsi="Times New Roman"/>
-                <w:b w:val="false"/>
-                <w:bCs w:val="false"/>
-                <w:sz w:val="20"/>
-                <w:szCs w:val="20"/>
-              </w:rPr>
-              <w:t xml:space="preserve">El repositorio contenia dos scripts de creacion distintos: uno creaba la base con otro nombre y sin la columna de baja logica, el otro con el nombre y la estructura que el sistema utiliza. Segun cual se ejecutara, la base quedaba diferente.</w:t>
-            </w:r>
-          </w:p>
-        </w:tc>
-        <w:tc>
-          <w:tcPr>
-            <w:tcW w:type="dxa" w:w="2620"/>
-            <w:tcMar>
-              <w:top w:type="dxa" w:w="60"/>
-              <w:left w:type="dxa" w:w="100"/>
-              <w:bottom w:type="dxa" w:w="60"/>
-              <w:right w:type="dxa" w:w="100"/>
-            </w:tcMar>
-          </w:tcPr>
-          <w:p>
-            <w:pPr>
-              <w:spacing w:after="20" w:before="20" w:line="240"/>
-              <w:jc w:val="left"/>
-            </w:pPr>
-            <w:r>
-              <w:rPr>
-                <w:rFonts w:ascii="Times New Roman" w:cs="Times New Roman" w:eastAsia="Times New Roman" w:hAnsi="Times New Roman"/>
-                <w:b w:val="false"/>
-                <w:bCs w:val="false"/>
-                <w:sz w:val="20"/>
-                <w:szCs w:val="20"/>
-              </w:rPr>
-              <w:t xml:space="preserve">Unificacion en un unico script y documentacion de la columna de baja logica en el diccionario de datos de la seccion 22.</w:t>
+              <w:t xml:space="preserve">Documentada en el diccionario de datos de la seccion 22, con la justificacion de la decision.</w:t>
             </w:r>
           </w:p>
         </w:tc>
@@ -35256,7 +35137,7 @@
           <w:sz w:val="24"/>
           <w:szCs w:val="24"/>
         </w:rPr>
-        <w:t xml:space="preserve">El ultimo hallazgo merece una aclaracion, porque su origen fue un error de documentacion y no de programacion. El script original seguia fielmente el diccionario de datos tal como estaba definido. La columna de baja logica fue agregada despues, durante la implementacion, sin incorporarla al diccionario. Es decir: la discrepancia no provino del trabajo de base de datos, sino de una modificacion del modelo que no se documento en su momento. Esta entrega corrige esa omision.</w:t>
+        <w:t xml:space="preserve">El segundo hallazgo merece una aclaracion, porque su origen fue un error de documentacion y no de programacion. El trabajo de base de datos seguia fielmente el diccionario de datos tal como estaba definido en su momento. La columna de baja logica fue agregada despues, durante la implementacion, sin incorporarla al diccionario. Es decir: la discrepancia no provino del diseno de la base, sino de una modificacion del modelo que no se documento cuando se hizo. Esta entrega corrige esa omision, y deja ademas asentado el motivo de la decision, que es lo que evita que vuelva a perderse.</w:t>
       </w:r>
     </w:p>
     <w:p>
@@ -35646,7 +35527,7 @@
                 <w:sz w:val="20"/>
                 <w:szCs w:val="20"/>
               </w:rPr>
-              <w:t xml:space="preserve">Revision del sistema por parte del docente y del cliente.</w:t>
+              <w:t xml:space="preserve">Revision del sistema en funcionamiento por parte del docente y del cliente.</w:t>
             </w:r>
           </w:p>
         </w:tc>
@@ -35673,7 +35554,7 @@
                 <w:sz w:val="20"/>
                 <w:szCs w:val="20"/>
               </w:rPr>
-              <w:t xml:space="preserve">Servidor virtual en la nube, con el backend en contenedor y el frontend compilado, publicados detras de un proxy inverso con cifrado y autenticacion. Se describe en la seccion 36.</w:t>
+              <w:t xml:space="preserve">El proyecto se abre en Visual Studio Code y se ejecutan el backend y el frontend en la misma computadora. El procedimiento se detalla en la seccion 36.</w:t>
             </w:r>
           </w:p>
         </w:tc>
@@ -35711,7 +35592,7 @@
           <w:sz w:val="24"/>
           <w:szCs w:val="24"/>
         </w:rPr>
-        <w:t xml:space="preserve">Del lado del servidor:</w:t>
+        <w:t xml:space="preserve">Para ejecutar el sistema:</w:t>
       </w:r>
     </w:p>
     <w:p>
@@ -35730,7 +35611,7 @@
           <w:sz w:val="24"/>
           <w:szCs w:val="24"/>
         </w:rPr>
-        <w:t xml:space="preserve">Sistema operativo Linux con Docker disponible.</w:t>
+        <w:t xml:space="preserve">Computadora personal con Windows, macOS o Linux.</w:t>
       </w:r>
     </w:p>
     <w:p>
@@ -35749,7 +35630,7 @@
           <w:sz w:val="24"/>
           <w:szCs w:val="24"/>
         </w:rPr>
-        <w:t xml:space="preserve">Node.js 20 o superior, en caso de ejecucion sin contenedor.</w:t>
+        <w:t xml:space="preserve">Node.js 20 o superior, que provee tambien el gestor de paquetes y el ejecutor de pruebas.</w:t>
       </w:r>
     </w:p>
     <w:p>
@@ -35768,7 +35649,7 @@
           <w:sz w:val="24"/>
           <w:szCs w:val="24"/>
         </w:rPr>
-        <w:t xml:space="preserve">MySQL 8, cuando se utiliza persistencia en base de datos.</w:t>
+        <w:t xml:space="preserve">Visual Studio Code, o cualquier editor equivalente.</w:t>
       </w:r>
     </w:p>
     <w:p>
@@ -35787,24 +35668,7 @@
           <w:sz w:val="24"/>
           <w:szCs w:val="24"/>
         </w:rPr>
-        <w:t xml:space="preserve">Memoria disponible: la aplicacion en modo memoria utiliza aproximadamente 22 MB, y su contenedor esta limitado a 160 MB.</w:t>
-      </w:r>
-    </w:p>
-    <w:p>
-      <w:pPr>
-        <w:spacing w:after="0" w:line="480"/>
-        <w:ind/>
-        <w:jc w:val="both"/>
-      </w:pPr>
-      <w:r>
-        <w:rPr>
-          <w:rFonts w:ascii="Times New Roman" w:cs="Times New Roman" w:eastAsia="Times New Roman" w:hAnsi="Times New Roman"/>
-          <w:b/>
-          <w:bCs/>
-          <w:sz w:val="24"/>
-          <w:szCs w:val="24"/>
-        </w:rPr>
-        <w:t xml:space="preserve">Del lado del cliente:</w:t>
+        <w:t xml:space="preserve">MySQL 8, unicamente cuando se desea trabajar con persistencia en base de datos. El sistema tambien funciona sin el.</w:t>
       </w:r>
     </w:p>
     <w:p>
@@ -35823,7 +35687,24 @@
           <w:sz w:val="24"/>
           <w:szCs w:val="24"/>
         </w:rPr>
-        <w:t xml:space="preserve">Navegador con soporte vigente: Google Chrome, Microsoft Edge o Mozilla Firefox.</w:t>
+        <w:t xml:space="preserve">Memoria disponible: el backend en modo memoria utiliza aproximadamente 22 MB.</w:t>
+      </w:r>
+    </w:p>
+    <w:p>
+      <w:pPr>
+        <w:spacing w:after="0" w:line="480"/>
+        <w:ind/>
+        <w:jc w:val="both"/>
+      </w:pPr>
+      <w:r>
+        <w:rPr>
+          <w:rFonts w:ascii="Times New Roman" w:cs="Times New Roman" w:eastAsia="Times New Roman" w:hAnsi="Times New Roman"/>
+          <w:b/>
+          <w:bCs/>
+          <w:sz w:val="24"/>
+          <w:szCs w:val="24"/>
+        </w:rPr>
+        <w:t xml:space="preserve">Para utilizarlo:</w:t>
       </w:r>
     </w:p>
     <w:p>
@@ -35842,7 +35723,7 @@
           <w:sz w:val="24"/>
           <w:szCs w:val="24"/>
         </w:rPr>
-        <w:t xml:space="preserve">Conexion a Internet.</w:t>
+        <w:t xml:space="preserve">Navegador con soporte vigente: Google Chrome, Microsoft Edge o Mozilla Firefox.</w:t>
       </w:r>
     </w:p>
     <w:p>
@@ -35862,6 +35743,21 @@
           <w:szCs w:val="24"/>
         </w:rPr>
         <w:t xml:space="preserve">Resolucion minima de 360 pixeles de ancho. La interfaz es adaptable y se verifico en telefono, tableta y escritorio.</w:t>
+      </w:r>
+    </w:p>
+    <w:p>
+      <w:pPr>
+        <w:spacing w:after="0" w:line="480"/>
+        <w:ind w:firstLine="720"/>
+        <w:jc w:val="both"/>
+      </w:pPr>
+      <w:r>
+        <w:rPr>
+          <w:rFonts w:ascii="Times New Roman" w:cs="Times New Roman" w:eastAsia="Times New Roman" w:hAnsi="Times New Roman"/>
+          <w:sz w:val="24"/>
+          <w:szCs w:val="24"/>
+        </w:rPr>
+        <w:t xml:space="preserve">Conviene senalar que el sistema no exige configuracion previa para arrancar. Los valores por defecto alcanzan, y si no encuentra una base de datos disponible continua con el juego de datos de prueba cargado en memoria, dejando constancia del motivo por consola. Esa decision fue deliberada: cualquier integrante, o quien evalue el proyecto, puede clonar el repositorio y tener el sistema funcionando con dos comandos.</w:t>
       </w:r>
     </w:p>
     <w:p>
@@ -36331,7 +36227,7 @@
                 <w:sz w:val="20"/>
                 <w:szCs w:val="20"/>
               </w:rPr>
-              <w:t xml:space="preserve">78.</w:t>
+              <w:t xml:space="preserve">65.</w:t>
             </w:r>
           </w:p>
         </w:tc>
@@ -36407,7 +36303,7 @@
           <w:sz w:val="24"/>
           <w:szCs w:val="24"/>
         </w:rPr>
-        <w:t xml:space="preserve">36.3. Publicacion de la demostracion</w:t>
+        <w:t xml:space="preserve">36.3. Puesta en marcha del sistema</w:t>
       </w:r>
       <w:bookmarkEnd w:id="90"/>
     </w:p>
@@ -36423,37 +36319,7 @@
           <w:sz w:val="24"/>
           <w:szCs w:val="24"/>
         </w:rPr>
-        <w:t xml:space="preserve">El sistema se publico en un servidor virtual propio para que el docente y el cliente puedan revisarlo en funcionamiento. La publicacion es privada y no constituye un sitio abierto al publico: todo el dominio esta protegido por usuario y contrasena, y se envia la indicacion de no indexacion para que los buscadores no lo incorporen a sus resultados.</w:t>
-      </w:r>
-    </w:p>
-    <w:p>
-      <w:pPr>
-        <w:spacing w:after="0" w:line="480"/>
-        <w:ind w:firstLine="720"/>
-        <w:jc w:val="both"/>
-      </w:pPr>
-      <w:r>
-        <w:rPr>
-          <w:rFonts w:ascii="Times New Roman" w:cs="Times New Roman" w:eastAsia="Times New Roman" w:hAnsi="Times New Roman"/>
-          <w:sz w:val="24"/>
-          <w:szCs w:val="24"/>
-        </w:rPr>
-        <w:t xml:space="preserve">El frontend compilado y la interfaz de programacion de aplicaciones se sirven bajo el mismo dominio. Las direcciones que comienzan con la ruta de la interfaz se redirigen al contenedor del backend, que escucha unicamente en la direccion local del servidor y nunca queda expuesto de forma directa; el resto entrega el frontend. Compartir dominio no es un detalle de comodidad: la autenticacion del navegador no adjunta las credenciales en peticiones hacia otro dominio, de modo que separar el frontend y la interfaz habria impedido que la demostracion privada funcionara.</w:t>
-      </w:r>
-    </w:p>
-    <w:p>
-      <w:pPr>
-        <w:spacing w:after="0" w:line="480"/>
-        <w:ind/>
-        <w:jc w:val="both"/>
-      </w:pPr>
-      <w:r>
-        <w:rPr>
-          <w:rFonts w:ascii="Times New Roman" w:cs="Times New Roman" w:eastAsia="Times New Roman" w:hAnsi="Times New Roman"/>
-          <w:sz w:val="24"/>
-          <w:szCs w:val="24"/>
-        </w:rPr>
-        <w:t xml:space="preserve">La demostracion se ejecuta en modo memoria, decision que responde a dos motivos:</w:t>
+        <w:t xml:space="preserve">El sistema se ejecuta localmente, abriendo el proyecto en Visual Studio Code. Son dos procesos que corren a la vez: el backend, que expone la interfaz de programacion de aplicaciones, y el frontend, que el servidor de desarrollo de Vite publica en el navegador. El procedimiento completo es el siguiente:</w:t>
       </w:r>
     </w:p>
     <w:p>
@@ -36472,7 +36338,7 @@
           <w:sz w:val="24"/>
           <w:szCs w:val="24"/>
         </w:rPr>
-        <w:t xml:space="preserve">El servidor comparte un gigabyte de memoria con otras aplicaciones. Un servidor MySQL adicional sumaria alrededor de 400 MB y pondria en riesgo su funcionamiento.</w:t>
+        <w:t xml:space="preserve">Clonar el repositorio y abrir la carpeta en Visual Studio Code.</w:t>
       </w:r>
     </w:p>
     <w:p>
@@ -36491,7 +36357,45 @@
           <w:sz w:val="24"/>
           <w:szCs w:val="24"/>
         </w:rPr>
-        <w:t xml:space="preserve">El sistema vuelve al juego de datos inicial en cada reinicio, de modo que la demostracion siempre comienza en un estado conocido y los valores de referencia de la seccion 30 son verificables en cualquier momento.</w:t>
+        <w:t xml:space="preserve">En una terminal, entrar en la carpeta del backend, instalar las dependencias y arrancarlo. Queda escuchando en el puerto 3000.</w:t>
+      </w:r>
+    </w:p>
+    <w:p>
+      <w:pPr>
+        <w:pStyle w:val="ListParagraph"/>
+        <w:numPr>
+          <w:ilvl w:val="0"/>
+          <w:numId w:val="3"/>
+        </w:numPr>
+        <w:spacing w:after="0" w:line="480"/>
+        <w:jc w:val="both"/>
+      </w:pPr>
+      <w:r>
+        <w:rPr>
+          <w:rFonts w:ascii="Times New Roman" w:cs="Times New Roman" w:eastAsia="Times New Roman" w:hAnsi="Times New Roman"/>
+          <w:sz w:val="24"/>
+          <w:szCs w:val="24"/>
+        </w:rPr>
+        <w:t xml:space="preserve">En una segunda terminal, entrar en la carpeta del frontend, instalar las dependencias y arrancar el servidor de desarrollo. Queda disponible en el puerto 5173.</w:t>
+      </w:r>
+    </w:p>
+    <w:p>
+      <w:pPr>
+        <w:pStyle w:val="ListParagraph"/>
+        <w:numPr>
+          <w:ilvl w:val="0"/>
+          <w:numId w:val="3"/>
+        </w:numPr>
+        <w:spacing w:after="0" w:line="480"/>
+        <w:jc w:val="both"/>
+      </w:pPr>
+      <w:r>
+        <w:rPr>
+          <w:rFonts w:ascii="Times New Roman" w:cs="Times New Roman" w:eastAsia="Times New Roman" w:hAnsi="Times New Roman"/>
+          <w:sz w:val="24"/>
+          <w:szCs w:val="24"/>
+        </w:rPr>
+        <w:t xml:space="preserve">Abrir esa direccion en el navegador e ingresar con alguno de los dos usuarios del juego de datos de prueba.</w:t>
       </w:r>
     </w:p>
     <w:p>
@@ -36506,26 +36410,61 @@
           <w:sz w:val="24"/>
           <w:szCs w:val="24"/>
         </w:rPr>
-        <w:t xml:space="preserve">El soporte de MySQL permanece intacto y se selecciona con una variable de entorno; el trabajo de base de datos de la integracion continua lo verifica en cada cambio. La interfaz informa en pantalla cuando el sistema se encuentra en modo de demostracion, de manera que la condicion nunca queda oculta para quien lo revisa.</w:t>
-      </w:r>
-    </w:p>
-    <w:p>
-      <w:pPr>
-        <w:pStyle w:val="Heading2"/>
-        <w:spacing w:after="120" w:before="240" w:line="480"/>
-      </w:pPr>
-      <w:bookmarkStart w:name="_Toc91" w:id="91"/>
-      <w:r>
-        <w:rPr>
-          <w:rFonts w:ascii="Times New Roman" w:cs="Times New Roman" w:eastAsia="Times New Roman" w:hAnsi="Times New Roman"/>
-          <w:b/>
-          <w:bCs/>
-          <w:sz w:val="24"/>
-          <w:szCs w:val="24"/>
-        </w:rPr>
-        <w:t xml:space="preserve">36.4. Verificacion del caracter privado</w:t>
-      </w:r>
-      <w:bookmarkEnd w:id="91"/>
+        <w:t xml:space="preserve">El servidor de desarrollo del frontend redirige al backend todas las peticiones cuya direccion comienza con la ruta de la interfaz, de modo que para el navegador ambos conviven en el mismo origen y no hay que configurar nada mas.</w:t>
+      </w:r>
+    </w:p>
+    <w:p>
+      <w:pPr>
+        <w:spacing w:after="0" w:line="480"/>
+        <w:ind/>
+        <w:jc w:val="both"/>
+      </w:pPr>
+      <w:r>
+        <w:rPr>
+          <w:rFonts w:ascii="Times New Roman" w:cs="Times New Roman" w:eastAsia="Times New Roman" w:hAnsi="Times New Roman"/>
+          <w:sz w:val="24"/>
+          <w:szCs w:val="24"/>
+        </w:rPr>
+        <w:t xml:space="preserve">La demostracion se ejecuta en modo memoria, decision que responde a dos motivos:</w:t>
+      </w:r>
+    </w:p>
+    <w:p>
+      <w:pPr>
+        <w:pStyle w:val="ListParagraph"/>
+        <w:numPr>
+          <w:ilvl w:val="0"/>
+          <w:numId w:val="3"/>
+        </w:numPr>
+        <w:spacing w:after="0" w:line="480"/>
+        <w:jc w:val="both"/>
+      </w:pPr>
+      <w:r>
+        <w:rPr>
+          <w:rFonts w:ascii="Times New Roman" w:cs="Times New Roman" w:eastAsia="Times New Roman" w:hAnsi="Times New Roman"/>
+          <w:sz w:val="24"/>
+          <w:szCs w:val="24"/>
+        </w:rPr>
+        <w:t xml:space="preserve">No requiere tener un servidor MySQL instalado y en funcionamiento, de modo que el sistema arranca en cualquier computadora con Node.js y en pocos segundos.</w:t>
+      </w:r>
+    </w:p>
+    <w:p>
+      <w:pPr>
+        <w:pStyle w:val="ListParagraph"/>
+        <w:numPr>
+          <w:ilvl w:val="0"/>
+          <w:numId w:val="3"/>
+        </w:numPr>
+        <w:spacing w:after="0" w:line="480"/>
+        <w:jc w:val="both"/>
+      </w:pPr>
+      <w:r>
+        <w:rPr>
+          <w:rFonts w:ascii="Times New Roman" w:cs="Times New Roman" w:eastAsia="Times New Roman" w:hAnsi="Times New Roman"/>
+          <w:sz w:val="24"/>
+          <w:szCs w:val="24"/>
+        </w:rPr>
+        <w:t xml:space="preserve">El sistema vuelve al juego de datos inicial en cada reinicio, de modo que la demostracion siempre comienza en un estado conocido y los valores de referencia de la seccion 30 son verificables en cualquier momento.</w:t>
+      </w:r>
     </w:p>
     <w:p>
       <w:pPr>
@@ -36539,7 +36478,116 @@
           <w:sz w:val="24"/>
           <w:szCs w:val="24"/>
         </w:rPr>
-        <w:t xml:space="preserve">Que la publicacion sea privada es una afirmacion verificable y no una declaracion de intenciones. Una peticion al dominio sin credenciales debe recibir como respuesta un codigo 401, que significa no autorizado. Si devolviera un codigo 200, que significa correcto, la proteccion no estaria aplicada. El procedimiento de comprobacion figura en el documento de despliegue del repositorio.</w:t>
+        <w:t xml:space="preserve">El soporte de MySQL permanece intacto y se selecciona con una variable de entorno; el trabajo de base de datos de la integracion continua lo verifica en cada cambio contra un servidor real. La interfaz informa en pantalla cuando el sistema se encuentra en modo de demostracion, de manera que la condicion nunca queda oculta para quien lo revisa.</w:t>
+      </w:r>
+    </w:p>
+    <w:p>
+      <w:pPr>
+        <w:pStyle w:val="Heading2"/>
+        <w:spacing w:after="120" w:before="240" w:line="480"/>
+      </w:pPr>
+      <w:bookmarkStart w:name="_Toc91" w:id="91"/>
+      <w:r>
+        <w:rPr>
+          <w:rFonts w:ascii="Times New Roman" w:cs="Times New Roman" w:eastAsia="Times New Roman" w:hAnsi="Times New Roman"/>
+          <w:b/>
+          <w:bCs/>
+          <w:sz w:val="24"/>
+          <w:szCs w:val="24"/>
+        </w:rPr>
+        <w:t xml:space="preserve">36.4. Que se puede comprobar en la demostracion</w:t>
+      </w:r>
+      <w:bookmarkEnd w:id="91"/>
+    </w:p>
+    <w:p>
+      <w:pPr>
+        <w:spacing w:after="0" w:line="480"/>
+        <w:ind w:firstLine="720"/>
+        <w:jc w:val="both"/>
+      </w:pPr>
+      <w:r>
+        <w:rPr>
+          <w:rFonts w:ascii="Times New Roman" w:cs="Times New Roman" w:eastAsia="Times New Roman" w:hAnsi="Times New Roman"/>
+          <w:sz w:val="24"/>
+          <w:szCs w:val="24"/>
+        </w:rPr>
+        <w:t xml:space="preserve">Como el juego de datos es siempre el mismo, la demostracion no se limita a mostrar pantallas: permite verificar resultados contra los valores documentados de antemano en la seccion 30. Un reporte que devuelve algun numero no prueba nada; uno que devuelve exactamente el numero esperado, si.</w:t>
+      </w:r>
+    </w:p>
+    <w:p>
+      <w:pPr>
+        <w:pStyle w:val="ListParagraph"/>
+        <w:numPr>
+          <w:ilvl w:val="0"/>
+          <w:numId w:val="3"/>
+        </w:numPr>
+        <w:spacing w:after="0" w:line="480"/>
+        <w:jc w:val="both"/>
+      </w:pPr>
+      <w:r>
+        <w:rPr>
+          <w:rFonts w:ascii="Times New Roman" w:cs="Times New Roman" w:eastAsia="Times New Roman" w:hAnsi="Times New Roman"/>
+          <w:sz w:val="24"/>
+          <w:szCs w:val="24"/>
+        </w:rPr>
+        <w:t xml:space="preserve">Registrar una venta de dos productos y comprobar que el total se calcula solo y que el stock de ambos disminuye en el catalogo.</w:t>
+      </w:r>
+    </w:p>
+    <w:p>
+      <w:pPr>
+        <w:pStyle w:val="ListParagraph"/>
+        <w:numPr>
+          <w:ilvl w:val="0"/>
+          <w:numId w:val="3"/>
+        </w:numPr>
+        <w:spacing w:after="0" w:line="480"/>
+        <w:jc w:val="both"/>
+      </w:pPr>
+      <w:r>
+        <w:rPr>
+          <w:rFonts w:ascii="Times New Roman" w:cs="Times New Roman" w:eastAsia="Times New Roman" w:hAnsi="Times New Roman"/>
+          <w:sz w:val="24"/>
+          <w:szCs w:val="24"/>
+        </w:rPr>
+        <w:t xml:space="preserve">Intentar vender mas unidades de las disponibles y comprobar que el sistema rechaza la operacion e informa el stock real.</w:t>
+      </w:r>
+    </w:p>
+    <w:p>
+      <w:pPr>
+        <w:pStyle w:val="ListParagraph"/>
+        <w:numPr>
+          <w:ilvl w:val="0"/>
+          <w:numId w:val="3"/>
+        </w:numPr>
+        <w:spacing w:after="0" w:line="480"/>
+        <w:jc w:val="both"/>
+      </w:pPr>
+      <w:r>
+        <w:rPr>
+          <w:rFonts w:ascii="Times New Roman" w:cs="Times New Roman" w:eastAsia="Times New Roman" w:hAnsi="Times New Roman"/>
+          <w:sz w:val="24"/>
+          <w:szCs w:val="24"/>
+        </w:rPr>
+        <w:t xml:space="preserve">Consultar el reporte del dia y contrastarlo con los valores de la tabla 22.</w:t>
+      </w:r>
+    </w:p>
+    <w:p>
+      <w:pPr>
+        <w:pStyle w:val="ListParagraph"/>
+        <w:numPr>
+          <w:ilvl w:val="0"/>
+          <w:numId w:val="3"/>
+        </w:numPr>
+        <w:spacing w:after="0" w:line="480"/>
+        <w:jc w:val="both"/>
+      </w:pPr>
+      <w:r>
+        <w:rPr>
+          <w:rFonts w:ascii="Times New Roman" w:cs="Times New Roman" w:eastAsia="Times New Roman" w:hAnsi="Times New Roman"/>
+          <w:sz w:val="24"/>
+          <w:szCs w:val="24"/>
+        </w:rPr>
+        <w:t xml:space="preserve">Ingresar como empleado e intentar acceder a los reportes, para comprobar que el control por rol se aplica.</w:t>
       </w:r>
     </w:p>
     <w:p>
@@ -36619,10 +36667,10 @@
         </w:tblBorders>
       </w:tblPr>
       <w:tblGrid>
+        <w:gridCol w:w="1778"/>
         <w:gridCol w:w="1872"/>
-        <w:gridCol w:w="1310"/>
-        <w:gridCol w:w="2059"/>
-        <w:gridCol w:w="4119"/>
+        <w:gridCol w:w="3370"/>
+        <w:gridCol w:w="2340"/>
       </w:tblGrid>
       <w:tr>
         <w:trPr>
@@ -36630,6 +36678,34 @@
         </w:trPr>
         <w:tc>
           <w:tcPr>
+            <w:tcW w:type="dxa" w:w="1778"/>
+            <w:shd w:fill="D9D9D9" w:color="auto" w:val="clear"/>
+            <w:tcMar>
+              <w:top w:type="dxa" w:w="60"/>
+              <w:left w:type="dxa" w:w="100"/>
+              <w:bottom w:type="dxa" w:w="60"/>
+              <w:right w:type="dxa" w:w="100"/>
+            </w:tcMar>
+          </w:tcPr>
+          <w:p>
+            <w:pPr>
+              <w:spacing w:after="20" w:before="20" w:line="240"/>
+              <w:jc w:val="center"/>
+            </w:pPr>
+            <w:r>
+              <w:rPr>
+                <w:rFonts w:ascii="Times New Roman" w:cs="Times New Roman" w:eastAsia="Times New Roman" w:hAnsi="Times New Roman"/>
+                <w:b/>
+                <w:bCs/>
+                <w:sz w:val="20"/>
+                <w:szCs w:val="20"/>
+              </w:rPr>
+              <w:t xml:space="preserve">Integrante</w:t>
+            </w:r>
+          </w:p>
+        </w:tc>
+        <w:tc>
+          <w:tcPr>
             <w:tcW w:type="dxa" w:w="1872"/>
             <w:shd w:fill="D9D9D9" w:color="auto" w:val="clear"/>
             <w:tcMar>
@@ -36652,13 +36728,13 @@
                 <w:sz w:val="20"/>
                 <w:szCs w:val="20"/>
               </w:rPr>
-              <w:t xml:space="preserve">Integrante</w:t>
-            </w:r>
-          </w:p>
-        </w:tc>
-        <w:tc>
-          <w:tcPr>
-            <w:tcW w:type="dxa" w:w="1310"/>
+              <w:t xml:space="preserve">Tickets</w:t>
+            </w:r>
+          </w:p>
+        </w:tc>
+        <w:tc>
+          <w:tcPr>
+            <w:tcW w:type="dxa" w:w="3370"/>
             <w:shd w:fill="D9D9D9" w:color="auto" w:val="clear"/>
             <w:tcMar>
               <w:top w:type="dxa" w:w="60"/>
@@ -36680,13 +36756,13 @@
                 <w:sz w:val="20"/>
                 <w:szCs w:val="20"/>
               </w:rPr>
-              <w:t xml:space="preserve">Commits</w:t>
-            </w:r>
-          </w:p>
-        </w:tc>
-        <w:tc>
-          <w:tcPr>
-            <w:tcW w:type="dxa" w:w="2059"/>
+              <w:t xml:space="preserve">Aporte principal</w:t>
+            </w:r>
+          </w:p>
+        </w:tc>
+        <w:tc>
+          <w:tcPr>
+            <w:tcW w:type="dxa" w:w="2340"/>
             <w:shd w:fill="D9D9D9" w:color="auto" w:val="clear"/>
             <w:tcMar>
               <w:top w:type="dxa" w:w="60"/>
@@ -36708,35 +36784,7 @@
                 <w:sz w:val="20"/>
                 <w:szCs w:val="20"/>
               </w:rPr>
-              <w:t xml:space="preserve">Tickets</w:t>
-            </w:r>
-          </w:p>
-        </w:tc>
-        <w:tc>
-          <w:tcPr>
-            <w:tcW w:type="dxa" w:w="4119"/>
-            <w:shd w:fill="D9D9D9" w:color="auto" w:val="clear"/>
-            <w:tcMar>
-              <w:top w:type="dxa" w:w="60"/>
-              <w:left w:type="dxa" w:w="100"/>
-              <w:bottom w:type="dxa" w:w="60"/>
-              <w:right w:type="dxa" w:w="100"/>
-            </w:tcMar>
-          </w:tcPr>
-          <w:p>
-            <w:pPr>
-              <w:spacing w:after="20" w:before="20" w:line="240"/>
-              <w:jc w:val="center"/>
-            </w:pPr>
-            <w:r>
-              <w:rPr>
-                <w:rFonts w:ascii="Times New Roman" w:cs="Times New Roman" w:eastAsia="Times New Roman" w:hAnsi="Times New Roman"/>
-                <w:b/>
-                <w:bCs/>
-                <w:sz w:val="20"/>
-                <w:szCs w:val="20"/>
-              </w:rPr>
-              <w:t xml:space="preserve">Aporte principal</w:t>
+              <w:t xml:space="preserve">Evidencia</w:t>
             </w:r>
           </w:p>
         </w:tc>
@@ -36744,6 +36792,33 @@
       <w:tr>
         <w:tc>
           <w:tcPr>
+            <w:tcW w:type="dxa" w:w="1778"/>
+            <w:tcMar>
+              <w:top w:type="dxa" w:w="60"/>
+              <w:left w:type="dxa" w:w="100"/>
+              <w:bottom w:type="dxa" w:w="60"/>
+              <w:right w:type="dxa" w:w="100"/>
+            </w:tcMar>
+          </w:tcPr>
+          <w:p>
+            <w:pPr>
+              <w:spacing w:after="20" w:before="20" w:line="240"/>
+              <w:jc w:val="left"/>
+            </w:pPr>
+            <w:r>
+              <w:rPr>
+                <w:rFonts w:ascii="Times New Roman" w:cs="Times New Roman" w:eastAsia="Times New Roman" w:hAnsi="Times New Roman"/>
+                <w:b w:val="false"/>
+                <w:bCs w:val="false"/>
+                <w:sz w:val="20"/>
+                <w:szCs w:val="20"/>
+              </w:rPr>
+              <w:t xml:space="preserve">Aaron Brumat</w:t>
+            </w:r>
+          </w:p>
+        </w:tc>
+        <w:tc>
+          <w:tcPr>
             <w:tcW w:type="dxa" w:w="1872"/>
             <w:tcMar>
               <w:top w:type="dxa" w:w="60"/>
@@ -36765,88 +36840,61 @@
                 <w:sz w:val="20"/>
                 <w:szCs w:val="20"/>
               </w:rPr>
-              <w:t xml:space="preserve">Aaron Brumat</w:t>
-            </w:r>
-          </w:p>
-        </w:tc>
-        <w:tc>
-          <w:tcPr>
-            <w:tcW w:type="dxa" w:w="1310"/>
-            <w:tcMar>
-              <w:top w:type="dxa" w:w="60"/>
-              <w:left w:type="dxa" w:w="100"/>
-              <w:bottom w:type="dxa" w:w="60"/>
-              <w:right w:type="dxa" w:w="100"/>
-            </w:tcMar>
-          </w:tcPr>
-          <w:p>
-            <w:pPr>
-              <w:spacing w:after="20" w:before="20" w:line="240"/>
-              <w:jc w:val="left"/>
-            </w:pPr>
-            <w:r>
-              <w:rPr>
-                <w:rFonts w:ascii="Times New Roman" w:cs="Times New Roman" w:eastAsia="Times New Roman" w:hAnsi="Times New Roman"/>
-                <w:b w:val="false"/>
-                <w:bCs w:val="false"/>
-                <w:sz w:val="20"/>
-                <w:szCs w:val="20"/>
-              </w:rPr>
-              <w:t xml:space="preserve">9</w:t>
-            </w:r>
-          </w:p>
-        </w:tc>
-        <w:tc>
-          <w:tcPr>
-            <w:tcW w:type="dxa" w:w="2059"/>
-            <w:tcMar>
-              <w:top w:type="dxa" w:w="60"/>
-              <w:left w:type="dxa" w:w="100"/>
-              <w:bottom w:type="dxa" w:w="60"/>
-              <w:right w:type="dxa" w:w="100"/>
-            </w:tcMar>
-          </w:tcPr>
-          <w:p>
-            <w:pPr>
-              <w:spacing w:after="20" w:before="20" w:line="240"/>
-              <w:jc w:val="left"/>
-            </w:pPr>
-            <w:r>
-              <w:rPr>
-                <w:rFonts w:ascii="Times New Roman" w:cs="Times New Roman" w:eastAsia="Times New Roman" w:hAnsi="Times New Roman"/>
-                <w:b w:val="false"/>
-                <w:bCs w:val="false"/>
-                <w:sz w:val="20"/>
-                <w:szCs w:val="20"/>
-              </w:rPr>
               <w:t xml:space="preserve">KIO-08</w:t>
             </w:r>
           </w:p>
         </w:tc>
         <w:tc>
           <w:tcPr>
-            <w:tcW w:type="dxa" w:w="4119"/>
-            <w:tcMar>
-              <w:top w:type="dxa" w:w="60"/>
-              <w:left w:type="dxa" w:w="100"/>
-              <w:bottom w:type="dxa" w:w="60"/>
-              <w:right w:type="dxa" w:w="100"/>
-            </w:tcMar>
-          </w:tcPr>
-          <w:p>
-            <w:pPr>
-              <w:spacing w:after="20" w:before="20" w:line="240"/>
-              <w:jc w:val="left"/>
-            </w:pPr>
-            <w:r>
-              <w:rPr>
-                <w:rFonts w:ascii="Times New Roman" w:cs="Times New Roman" w:eastAsia="Times New Roman" w:hAnsi="Times New Roman"/>
-                <w:b w:val="false"/>
-                <w:bCs w:val="false"/>
-                <w:sz w:val="20"/>
-                <w:szCs w:val="20"/>
-              </w:rPr>
-              <w:t xml:space="preserve">Plan de pruebas, 129 casos documentados, 65 pruebas automatizadas, integracion continua, registro de defectos, documentacion y publicacion de la demostracion.</w:t>
+            <w:tcW w:type="dxa" w:w="3370"/>
+            <w:tcMar>
+              <w:top w:type="dxa" w:w="60"/>
+              <w:left w:type="dxa" w:w="100"/>
+              <w:bottom w:type="dxa" w:w="60"/>
+              <w:right w:type="dxa" w:w="100"/>
+            </w:tcMar>
+          </w:tcPr>
+          <w:p>
+            <w:pPr>
+              <w:spacing w:after="20" w:before="20" w:line="240"/>
+              <w:jc w:val="left"/>
+            </w:pPr>
+            <w:r>
+              <w:rPr>
+                <w:rFonts w:ascii="Times New Roman" w:cs="Times New Roman" w:eastAsia="Times New Roman" w:hAnsi="Times New Roman"/>
+                <w:b w:val="false"/>
+                <w:bCs w:val="false"/>
+                <w:sz w:val="20"/>
+                <w:szCs w:val="20"/>
+              </w:rPr>
+              <w:t xml:space="preserve">Plan de pruebas, 129 casos documentados, 65 pruebas automatizadas, integracion continua, registro y cierre de defectos, y la documentacion del proyecto.</w:t>
+            </w:r>
+          </w:p>
+        </w:tc>
+        <w:tc>
+          <w:tcPr>
+            <w:tcW w:type="dxa" w:w="2340"/>
+            <w:tcMar>
+              <w:top w:type="dxa" w:w="60"/>
+              <w:left w:type="dxa" w:w="100"/>
+              <w:bottom w:type="dxa" w:w="60"/>
+              <w:right w:type="dxa" w:w="100"/>
+            </w:tcMar>
+          </w:tcPr>
+          <w:p>
+            <w:pPr>
+              <w:spacing w:after="20" w:before="20" w:line="240"/>
+              <w:jc w:val="left"/>
+            </w:pPr>
+            <w:r>
+              <w:rPr>
+                <w:rFonts w:ascii="Times New Roman" w:cs="Times New Roman" w:eastAsia="Times New Roman" w:hAnsi="Times New Roman"/>
+                <w:b w:val="false"/>
+                <w:bCs w:val="false"/>
+                <w:sz w:val="20"/>
+                <w:szCs w:val="20"/>
+              </w:rPr>
+              <w:t xml:space="preserve">11 commits propios en la rama principal</w:t>
             </w:r>
           </w:p>
         </w:tc>
@@ -36854,6 +36902,33 @@
       <w:tr>
         <w:tc>
           <w:tcPr>
+            <w:tcW w:type="dxa" w:w="1778"/>
+            <w:tcMar>
+              <w:top w:type="dxa" w:w="60"/>
+              <w:left w:type="dxa" w:w="100"/>
+              <w:bottom w:type="dxa" w:w="60"/>
+              <w:right w:type="dxa" w:w="100"/>
+            </w:tcMar>
+          </w:tcPr>
+          <w:p>
+            <w:pPr>
+              <w:spacing w:after="20" w:before="20" w:line="240"/>
+              <w:jc w:val="left"/>
+            </w:pPr>
+            <w:r>
+              <w:rPr>
+                <w:rFonts w:ascii="Times New Roman" w:cs="Times New Roman" w:eastAsia="Times New Roman" w:hAnsi="Times New Roman"/>
+                <w:b w:val="false"/>
+                <w:bCs w:val="false"/>
+                <w:sz w:val="20"/>
+                <w:szCs w:val="20"/>
+              </w:rPr>
+              <w:t xml:space="preserve">Lucas Beim</w:t>
+            </w:r>
+          </w:p>
+        </w:tc>
+        <w:tc>
+          <w:tcPr>
             <w:tcW w:type="dxa" w:w="1872"/>
             <w:tcMar>
               <w:top w:type="dxa" w:w="60"/>
@@ -36875,88 +36950,61 @@
                 <w:sz w:val="20"/>
                 <w:szCs w:val="20"/>
               </w:rPr>
-              <w:t xml:space="preserve">Leonardo Vertali</w:t>
-            </w:r>
-          </w:p>
-        </w:tc>
-        <w:tc>
-          <w:tcPr>
-            <w:tcW w:type="dxa" w:w="1310"/>
-            <w:tcMar>
-              <w:top w:type="dxa" w:w="60"/>
-              <w:left w:type="dxa" w:w="100"/>
-              <w:bottom w:type="dxa" w:w="60"/>
-              <w:right w:type="dxa" w:w="100"/>
-            </w:tcMar>
-          </w:tcPr>
-          <w:p>
-            <w:pPr>
-              <w:spacing w:after="20" w:before="20" w:line="240"/>
-              <w:jc w:val="left"/>
-            </w:pPr>
-            <w:r>
-              <w:rPr>
-                <w:rFonts w:ascii="Times New Roman" w:cs="Times New Roman" w:eastAsia="Times New Roman" w:hAnsi="Times New Roman"/>
-                <w:b w:val="false"/>
-                <w:bCs w:val="false"/>
-                <w:sz w:val="20"/>
-                <w:szCs w:val="20"/>
-              </w:rPr>
-              <w:t xml:space="preserve">4</w:t>
-            </w:r>
-          </w:p>
-        </w:tc>
-        <w:tc>
-          <w:tcPr>
-            <w:tcW w:type="dxa" w:w="2059"/>
-            <w:tcMar>
-              <w:top w:type="dxa" w:w="60"/>
-              <w:left w:type="dxa" w:w="100"/>
-              <w:bottom w:type="dxa" w:w="60"/>
-              <w:right w:type="dxa" w:w="100"/>
-            </w:tcMar>
-          </w:tcPr>
-          <w:p>
-            <w:pPr>
-              <w:spacing w:after="20" w:before="20" w:line="240"/>
-              <w:jc w:val="left"/>
-            </w:pPr>
-            <w:r>
-              <w:rPr>
-                <w:rFonts w:ascii="Times New Roman" w:cs="Times New Roman" w:eastAsia="Times New Roman" w:hAnsi="Times New Roman"/>
-                <w:b w:val="false"/>
-                <w:bCs w:val="false"/>
-                <w:sz w:val="20"/>
-                <w:szCs w:val="20"/>
-              </w:rPr>
-              <w:t xml:space="preserve">KIO-03, KIO-04, KIO-05</w:t>
-            </w:r>
-          </w:p>
-        </w:tc>
-        <w:tc>
-          <w:tcPr>
-            <w:tcW w:type="dxa" w:w="4119"/>
-            <w:tcMar>
-              <w:top w:type="dxa" w:w="60"/>
-              <w:left w:type="dxa" w:w="100"/>
-              <w:bottom w:type="dxa" w:w="60"/>
-              <w:right w:type="dxa" w:w="100"/>
-            </w:tcMar>
-          </w:tcPr>
-          <w:p>
-            <w:pPr>
-              <w:spacing w:after="20" w:before="20" w:line="240"/>
-              <w:jc w:val="left"/>
-            </w:pPr>
-            <w:r>
-              <w:rPr>
-                <w:rFonts w:ascii="Times New Roman" w:cs="Times New Roman" w:eastAsia="Times New Roman" w:hAnsi="Times New Roman"/>
-                <w:b w:val="false"/>
-                <w:bCs w:val="false"/>
-                <w:sz w:val="20"/>
-                <w:szCs w:val="20"/>
-              </w:rPr>
-              <w:t xml:space="preserve">Esquema de la base de datos, procedimiento almacenado de bajas, vistas analiticas e indices de apoyo.</w:t>
+              <w:t xml:space="preserve">KIO-06, KIO-07, KIO-01</w:t>
+            </w:r>
+          </w:p>
+        </w:tc>
+        <w:tc>
+          <w:tcPr>
+            <w:tcW w:type="dxa" w:w="3370"/>
+            <w:tcMar>
+              <w:top w:type="dxa" w:w="60"/>
+              <w:left w:type="dxa" w:w="100"/>
+              <w:bottom w:type="dxa" w:w="60"/>
+              <w:right w:type="dxa" w:w="100"/>
+            </w:tcMar>
+          </w:tcPr>
+          <w:p>
+            <w:pPr>
+              <w:spacing w:after="20" w:before="20" w:line="240"/>
+              <w:jc w:val="left"/>
+            </w:pPr>
+            <w:r>
+              <w:rPr>
+                <w:rFonts w:ascii="Times New Roman" w:cs="Times New Roman" w:eastAsia="Times New Roman" w:hAnsi="Times New Roman"/>
+                <w:b w:val="false"/>
+                <w:bCs w:val="false"/>
+                <w:sz w:val="20"/>
+                <w:szCs w:val="20"/>
+              </w:rPr>
+              <w:t xml:space="preserve">Pantalla del tablero con ventas del dia y alertas de stock, y el limite de intentos de ingreso.</w:t>
+            </w:r>
+          </w:p>
+        </w:tc>
+        <w:tc>
+          <w:tcPr>
+            <w:tcW w:type="dxa" w:w="2340"/>
+            <w:tcMar>
+              <w:top w:type="dxa" w:w="60"/>
+              <w:left w:type="dxa" w:w="100"/>
+              <w:bottom w:type="dxa" w:w="60"/>
+              <w:right w:type="dxa" w:w="100"/>
+            </w:tcMar>
+          </w:tcPr>
+          <w:p>
+            <w:pPr>
+              <w:spacing w:after="20" w:before="20" w:line="240"/>
+              <w:jc w:val="left"/>
+            </w:pPr>
+            <w:r>
+              <w:rPr>
+                <w:rFonts w:ascii="Times New Roman" w:cs="Times New Roman" w:eastAsia="Times New Roman" w:hAnsi="Times New Roman"/>
+                <w:b w:val="false"/>
+                <w:bCs w:val="false"/>
+                <w:sz w:val="20"/>
+                <w:szCs w:val="20"/>
+              </w:rPr>
+              <w:t xml:space="preserve">6 commits propios en la rama principal</w:t>
             </w:r>
           </w:p>
         </w:tc>
@@ -36964,6 +37012,33 @@
       <w:tr>
         <w:tc>
           <w:tcPr>
+            <w:tcW w:type="dxa" w:w="1778"/>
+            <w:tcMar>
+              <w:top w:type="dxa" w:w="60"/>
+              <w:left w:type="dxa" w:w="100"/>
+              <w:bottom w:type="dxa" w:w="60"/>
+              <w:right w:type="dxa" w:w="100"/>
+            </w:tcMar>
+          </w:tcPr>
+          <w:p>
+            <w:pPr>
+              <w:spacing w:after="20" w:before="20" w:line="240"/>
+              <w:jc w:val="left"/>
+            </w:pPr>
+            <w:r>
+              <w:rPr>
+                <w:rFonts w:ascii="Times New Roman" w:cs="Times New Roman" w:eastAsia="Times New Roman" w:hAnsi="Times New Roman"/>
+                <w:b w:val="false"/>
+                <w:bCs w:val="false"/>
+                <w:sz w:val="20"/>
+                <w:szCs w:val="20"/>
+              </w:rPr>
+              <w:t xml:space="preserve">Leonardo Vertali</w:t>
+            </w:r>
+          </w:p>
+        </w:tc>
+        <w:tc>
+          <w:tcPr>
             <w:tcW w:type="dxa" w:w="1872"/>
             <w:tcMar>
               <w:top w:type="dxa" w:w="60"/>
@@ -36985,88 +37060,61 @@
                 <w:sz w:val="20"/>
                 <w:szCs w:val="20"/>
               </w:rPr>
-              <w:t xml:space="preserve">Lucas Beim</w:t>
-            </w:r>
-          </w:p>
-        </w:tc>
-        <w:tc>
-          <w:tcPr>
-            <w:tcW w:type="dxa" w:w="1310"/>
-            <w:tcMar>
-              <w:top w:type="dxa" w:w="60"/>
-              <w:left w:type="dxa" w:w="100"/>
-              <w:bottom w:type="dxa" w:w="60"/>
-              <w:right w:type="dxa" w:w="100"/>
-            </w:tcMar>
-          </w:tcPr>
-          <w:p>
-            <w:pPr>
-              <w:spacing w:after="20" w:before="20" w:line="240"/>
-              <w:jc w:val="left"/>
-            </w:pPr>
-            <w:r>
-              <w:rPr>
-                <w:rFonts w:ascii="Times New Roman" w:cs="Times New Roman" w:eastAsia="Times New Roman" w:hAnsi="Times New Roman"/>
-                <w:b w:val="false"/>
-                <w:bCs w:val="false"/>
-                <w:sz w:val="20"/>
-                <w:szCs w:val="20"/>
-              </w:rPr>
-              <w:t xml:space="preserve">3</w:t>
-            </w:r>
-          </w:p>
-        </w:tc>
-        <w:tc>
-          <w:tcPr>
-            <w:tcW w:type="dxa" w:w="2059"/>
-            <w:tcMar>
-              <w:top w:type="dxa" w:w="60"/>
-              <w:left w:type="dxa" w:w="100"/>
-              <w:bottom w:type="dxa" w:w="60"/>
-              <w:right w:type="dxa" w:w="100"/>
-            </w:tcMar>
-          </w:tcPr>
-          <w:p>
-            <w:pPr>
-              <w:spacing w:after="20" w:before="20" w:line="240"/>
-              <w:jc w:val="left"/>
-            </w:pPr>
-            <w:r>
-              <w:rPr>
-                <w:rFonts w:ascii="Times New Roman" w:cs="Times New Roman" w:eastAsia="Times New Roman" w:hAnsi="Times New Roman"/>
-                <w:b w:val="false"/>
-                <w:bCs w:val="false"/>
-                <w:sz w:val="20"/>
-                <w:szCs w:val="20"/>
-              </w:rPr>
-              <w:t xml:space="preserve">KIO-06, KIO-07</w:t>
-            </w:r>
-          </w:p>
-        </w:tc>
-        <w:tc>
-          <w:tcPr>
-            <w:tcW w:type="dxa" w:w="4119"/>
-            <w:tcMar>
-              <w:top w:type="dxa" w:w="60"/>
-              <w:left w:type="dxa" w:w="100"/>
-              <w:bottom w:type="dxa" w:w="60"/>
-              <w:right w:type="dxa" w:w="100"/>
-            </w:tcMar>
-          </w:tcPr>
-          <w:p>
-            <w:pPr>
-              <w:spacing w:after="20" w:before="20" w:line="240"/>
-              <w:jc w:val="left"/>
-            </w:pPr>
-            <w:r>
-              <w:rPr>
-                <w:rFonts w:ascii="Times New Roman" w:cs="Times New Roman" w:eastAsia="Times New Roman" w:hAnsi="Times New Roman"/>
-                <w:b w:val="false"/>
-                <w:bCs w:val="false"/>
-                <w:sz w:val="20"/>
-                <w:szCs w:val="20"/>
-              </w:rPr>
-              <w:t xml:space="preserve">Pantalla del tablero con ventas del dia, alertas de stock bajo y productos proximos a vencer.</w:t>
+              <w:t xml:space="preserve">KIO-03, KIO-04, KIO-05</w:t>
+            </w:r>
+          </w:p>
+        </w:tc>
+        <w:tc>
+          <w:tcPr>
+            <w:tcW w:type="dxa" w:w="3370"/>
+            <w:tcMar>
+              <w:top w:type="dxa" w:w="60"/>
+              <w:left w:type="dxa" w:w="100"/>
+              <w:bottom w:type="dxa" w:w="60"/>
+              <w:right w:type="dxa" w:w="100"/>
+            </w:tcMar>
+          </w:tcPr>
+          <w:p>
+            <w:pPr>
+              <w:spacing w:after="20" w:before="20" w:line="240"/>
+              <w:jc w:val="left"/>
+            </w:pPr>
+            <w:r>
+              <w:rPr>
+                <w:rFonts w:ascii="Times New Roman" w:cs="Times New Roman" w:eastAsia="Times New Roman" w:hAnsi="Times New Roman"/>
+                <w:b w:val="false"/>
+                <w:bCs w:val="false"/>
+                <w:sz w:val="20"/>
+                <w:szCs w:val="20"/>
+              </w:rPr>
+              <w:t xml:space="preserve">Esquema de la base de datos, procedimiento almacenado de bajas, vistas analiticas e indices de apoyo.</w:t>
+            </w:r>
+          </w:p>
+        </w:tc>
+        <w:tc>
+          <w:tcPr>
+            <w:tcW w:type="dxa" w:w="2340"/>
+            <w:tcMar>
+              <w:top w:type="dxa" w:w="60"/>
+              <w:left w:type="dxa" w:w="100"/>
+              <w:bottom w:type="dxa" w:w="60"/>
+              <w:right w:type="dxa" w:w="100"/>
+            </w:tcMar>
+          </w:tcPr>
+          <w:p>
+            <w:pPr>
+              <w:spacing w:after="20" w:before="20" w:line="240"/>
+              <w:jc w:val="left"/>
+            </w:pPr>
+            <w:r>
+              <w:rPr>
+                <w:rFonts w:ascii="Times New Roman" w:cs="Times New Roman" w:eastAsia="Times New Roman" w:hAnsi="Times New Roman"/>
+                <w:b w:val="false"/>
+                <w:bCs w:val="false"/>
+                <w:sz w:val="20"/>
+                <w:szCs w:val="20"/>
+              </w:rPr>
+              <w:t xml:space="preserve">4 commits propios en la rama principal</w:t>
             </w:r>
           </w:p>
         </w:tc>
@@ -37074,6 +37122,33 @@
       <w:tr>
         <w:tc>
           <w:tcPr>
+            <w:tcW w:type="dxa" w:w="1778"/>
+            <w:tcMar>
+              <w:top w:type="dxa" w:w="60"/>
+              <w:left w:type="dxa" w:w="100"/>
+              <w:bottom w:type="dxa" w:w="60"/>
+              <w:right w:type="dxa" w:w="100"/>
+            </w:tcMar>
+          </w:tcPr>
+          <w:p>
+            <w:pPr>
+              <w:spacing w:after="20" w:before="20" w:line="240"/>
+              <w:jc w:val="left"/>
+            </w:pPr>
+            <w:r>
+              <w:rPr>
+                <w:rFonts w:ascii="Times New Roman" w:cs="Times New Roman" w:eastAsia="Times New Roman" w:hAnsi="Times New Roman"/>
+                <w:b w:val="false"/>
+                <w:bCs w:val="false"/>
+                <w:sz w:val="20"/>
+                <w:szCs w:val="20"/>
+              </w:rPr>
+              <w:t xml:space="preserve">Elian Cavenatti</w:t>
+            </w:r>
+          </w:p>
+        </w:tc>
+        <w:tc>
+          <w:tcPr>
             <w:tcW w:type="dxa" w:w="1872"/>
             <w:tcMar>
               <w:top w:type="dxa" w:w="60"/>
@@ -37095,88 +37170,61 @@
                 <w:sz w:val="20"/>
                 <w:szCs w:val="20"/>
               </w:rPr>
-              <w:t xml:space="preserve">Elian Cavenatti</w:t>
-            </w:r>
-          </w:p>
-        </w:tc>
-        <w:tc>
-          <w:tcPr>
-            <w:tcW w:type="dxa" w:w="1310"/>
-            <w:tcMar>
-              <w:top w:type="dxa" w:w="60"/>
-              <w:left w:type="dxa" w:w="100"/>
-              <w:bottom w:type="dxa" w:w="60"/>
-              <w:right w:type="dxa" w:w="100"/>
-            </w:tcMar>
-          </w:tcPr>
-          <w:p>
-            <w:pPr>
-              <w:spacing w:after="20" w:before="20" w:line="240"/>
-              <w:jc w:val="left"/>
-            </w:pPr>
-            <w:r>
-              <w:rPr>
-                <w:rFonts w:ascii="Times New Roman" w:cs="Times New Roman" w:eastAsia="Times New Roman" w:hAnsi="Times New Roman"/>
-                <w:b w:val="false"/>
-                <w:bCs w:val="false"/>
-                <w:sz w:val="20"/>
-                <w:szCs w:val="20"/>
-              </w:rPr>
-              <w:t xml:space="preserve">3</w:t>
-            </w:r>
-          </w:p>
-        </w:tc>
-        <w:tc>
-          <w:tcPr>
-            <w:tcW w:type="dxa" w:w="2059"/>
-            <w:tcMar>
-              <w:top w:type="dxa" w:w="60"/>
-              <w:left w:type="dxa" w:w="100"/>
-              <w:bottom w:type="dxa" w:w="60"/>
-              <w:right w:type="dxa" w:w="100"/>
-            </w:tcMar>
-          </w:tcPr>
-          <w:p>
-            <w:pPr>
-              <w:spacing w:after="20" w:before="20" w:line="240"/>
-              <w:jc w:val="left"/>
-            </w:pPr>
-            <w:r>
-              <w:rPr>
-                <w:rFonts w:ascii="Times New Roman" w:cs="Times New Roman" w:eastAsia="Times New Roman" w:hAnsi="Times New Roman"/>
-                <w:b w:val="false"/>
-                <w:bCs w:val="false"/>
-                <w:sz w:val="20"/>
-                <w:szCs w:val="20"/>
-              </w:rPr>
               <w:t xml:space="preserve">KIO-01, KIO-02</w:t>
             </w:r>
           </w:p>
         </w:tc>
         <w:tc>
           <w:tcPr>
-            <w:tcW w:type="dxa" w:w="4119"/>
-            <w:tcMar>
-              <w:top w:type="dxa" w:w="60"/>
-              <w:left w:type="dxa" w:w="100"/>
-              <w:bottom w:type="dxa" w:w="60"/>
-              <w:right w:type="dxa" w:w="100"/>
-            </w:tcMar>
-          </w:tcPr>
-          <w:p>
-            <w:pPr>
-              <w:spacing w:after="20" w:before="20" w:line="240"/>
-              <w:jc w:val="left"/>
-            </w:pPr>
-            <w:r>
-              <w:rPr>
-                <w:rFonts w:ascii="Times New Roman" w:cs="Times New Roman" w:eastAsia="Times New Roman" w:hAnsi="Times New Roman"/>
-                <w:b w:val="false"/>
-                <w:bCs w:val="false"/>
-                <w:sz w:val="20"/>
-                <w:szCs w:val="20"/>
-              </w:rPr>
-              <w:t xml:space="preserve">Seguridad del inicio de sesion, limite de intentos, codigo de error propio para la sesion vencida y correccion del defecto DEF-003.</w:t>
+            <w:tcW w:type="dxa" w:w="3370"/>
+            <w:tcMar>
+              <w:top w:type="dxa" w:w="60"/>
+              <w:left w:type="dxa" w:w="100"/>
+              <w:bottom w:type="dxa" w:w="60"/>
+              <w:right w:type="dxa" w:w="100"/>
+            </w:tcMar>
+          </w:tcPr>
+          <w:p>
+            <w:pPr>
+              <w:spacing w:after="20" w:before="20" w:line="240"/>
+              <w:jc w:val="left"/>
+            </w:pPr>
+            <w:r>
+              <w:rPr>
+                <w:rFonts w:ascii="Times New Roman" w:cs="Times New Roman" w:eastAsia="Times New Roman" w:hAnsi="Times New Roman"/>
+                <w:b w:val="false"/>
+                <w:bCs w:val="false"/>
+                <w:sz w:val="20"/>
+                <w:szCs w:val="20"/>
+              </w:rPr>
+              <w:t xml:space="preserve">Integracion entre la interfaz y la base de datos, autenticacion y flujo de registro de ventas.</w:t>
+            </w:r>
+          </w:p>
+        </w:tc>
+        <w:tc>
+          <w:tcPr>
+            <w:tcW w:type="dxa" w:w="2340"/>
+            <w:tcMar>
+              <w:top w:type="dxa" w:w="60"/>
+              <w:left w:type="dxa" w:w="100"/>
+              <w:bottom w:type="dxa" w:w="60"/>
+              <w:right w:type="dxa" w:w="100"/>
+            </w:tcMar>
+          </w:tcPr>
+          <w:p>
+            <w:pPr>
+              <w:spacing w:after="20" w:before="20" w:line="240"/>
+              <w:jc w:val="left"/>
+            </w:pPr>
+            <w:r>
+              <w:rPr>
+                <w:rFonts w:ascii="Times New Roman" w:cs="Times New Roman" w:eastAsia="Times New Roman" w:hAnsi="Times New Roman"/>
+                <w:b w:val="false"/>
+                <w:bCs w:val="false"/>
+                <w:sz w:val="20"/>
+                <w:szCs w:val="20"/>
+              </w:rPr>
+              <w:t xml:space="preserve">Secciones 13, 14 y 25 de este documento</w:t>
             </w:r>
           </w:p>
         </w:tc>
@@ -37202,7 +37250,7 @@
           <w:sz w:val="20"/>
           <w:szCs w:val="20"/>
         </w:rPr>
-        <w:t xml:space="preserve">El recuento corresponde a los commits propios de cada integrante, sin contar los de integracion de ramas. Los commits de Elian Cavenatti y los aportes adicionales de Lucas Beim y Leonardo Vertali derivados de la auditoria de la seccion 34 se incorporan mediante solicitudes de incorporacion de cambios abiertas al cierre de esta redaccion; sus identificadores deben completarse con los del historial definitivo.</w:t>
+        <w:t xml:space="preserve">El recuento corresponde a los commits propios de cada integrante, sin contar los de integracion de ramas. Cada commit conserva en el historial su autor, su fecha, su mensaje y el detalle de los archivos modificados, y cada solicitud de incorporacion de cambios conserva su revision y el resultado de la integracion continua.</w:t>
       </w:r>
     </w:p>
     <w:p>
@@ -37281,26 +37329,8 @@
           <w:sz w:val="24"/>
           <w:szCs w:val="24"/>
         </w:rPr>
-        <w:t xml:space="preserve">Desde el punto de vista academico, el proyecto permitio recorrer el ciclo de vida completo de un desarrollo de software: relevamiento, analisis, diseno, implementacion, pruebas, correccion de defectos, documentacion y publicacion. La leccion mas concreta que deja el trabajo no es tecnica sino metodologica, y surge del riesgo R-05: dos de los tres defectos registrados correspondieron a codigo generado con asistencia de inteligencia artificial que resultaba correcto a la lectura e incorrecto en los casos de borde. Ninguno fue hallado revisando el codigo; ambos aparecieron al escribir una prueba que ejercitaba el limite. La inteligencia artificial acelero el desarrollo, pero fue el trabajo de verificacion el que evito que esos errores llegaran a la entrega.</w:t>
-      </w:r>
-    </w:p>
-    <w:p>
-      <w:pPr>
-        <w:pStyle w:val="Heading2"/>
-        <w:spacing w:after="120" w:before="240" w:line="480"/>
-      </w:pPr>
-      <w:bookmarkStart w:name="_Toc94" w:id="94"/>
-      <w:r>
-        <w:rPr>
-          <w:rFonts w:ascii="Times New Roman" w:cs="Times New Roman" w:eastAsia="Times New Roman" w:hAnsi="Times New Roman"/>
-          <w:b/>
-          <w:bCs/>
-          <w:sz w:val="24"/>
-          <w:szCs w:val="24"/>
-        </w:rPr>
-        <w:t xml:space="preserve">38.1. Trabajo pendiente</w:t>
-      </w:r>
-      <w:bookmarkEnd w:id="94"/>
+        <w:t xml:space="preserve">Desde el punto de vista academico, el proyecto permitio recorrer el ciclo de vida completo de un desarrollo de software: relevamiento, analisis, diseno, implementacion, pruebas, correccion de defectos, documentacion y puesta en funcionamiento. La leccion mas concreta que deja el trabajo no es tecnica sino metodologica, y surge del riesgo R-05: dos de los tres defectos registrados correspondieron a codigo generado con asistencia de inteligencia artificial que resultaba correcto a la lectura e incorrecto en los casos de borde. Ninguno fue hallado revisando el codigo; ambos aparecieron al escribir una prueba que ejercitaba el limite. La inteligencia artificial acelero el desarrollo, pero fue el trabajo de verificacion el que evito que esos errores llegaran a la entrega.</w:t>
+      </w:r>
     </w:p>
     <w:p>
       <w:pPr>
@@ -37314,64 +37344,7 @@
           <w:sz w:val="24"/>
           <w:szCs w:val="24"/>
         </w:rPr>
-        <w:t xml:space="preserve">Se consignan, por honestidad metodologica, los puntos que quedan abiertos:</w:t>
-      </w:r>
-    </w:p>
-    <w:p>
-      <w:pPr>
-        <w:pStyle w:val="ListParagraph"/>
-        <w:numPr>
-          <w:ilvl w:val="0"/>
-          <w:numId w:val="2"/>
-        </w:numPr>
-        <w:spacing w:after="0" w:line="480"/>
-        <w:jc w:val="both"/>
-      </w:pPr>
-      <w:r>
-        <w:rPr>
-          <w:rFonts w:ascii="Times New Roman" w:cs="Times New Roman" w:eastAsia="Times New Roman" w:hAnsi="Times New Roman"/>
-          <w:sz w:val="24"/>
-          <w:szCs w:val="24"/>
-        </w:rPr>
-        <w:t xml:space="preserve">El acta de validacion firmada por el cliente sobre el sistema terminado, que completaria la mitigacion del riesgo R-03.</w:t>
-      </w:r>
-    </w:p>
-    <w:p>
-      <w:pPr>
-        <w:pStyle w:val="ListParagraph"/>
-        <w:numPr>
-          <w:ilvl w:val="0"/>
-          <w:numId w:val="2"/>
-        </w:numPr>
-        <w:spacing w:after="0" w:line="480"/>
-        <w:jc w:val="both"/>
-      </w:pPr>
-      <w:r>
-        <w:rPr>
-          <w:rFonts w:ascii="Times New Roman" w:cs="Times New Roman" w:eastAsia="Times New Roman" w:hAnsi="Times New Roman"/>
-          <w:sz w:val="24"/>
-          <w:szCs w:val="24"/>
-        </w:rPr>
-        <w:t xml:space="preserve">La verificacion del requerimiento RNF-03 en Mozilla Firefox, realizada hasta ahora en navegadores basados en Chromium.</w:t>
-      </w:r>
-    </w:p>
-    <w:p>
-      <w:pPr>
-        <w:pStyle w:val="ListParagraph"/>
-        <w:numPr>
-          <w:ilvl w:val="0"/>
-          <w:numId w:val="2"/>
-        </w:numPr>
-        <w:spacing w:after="0" w:line="480"/>
-        <w:jc w:val="both"/>
-      </w:pPr>
-      <w:r>
-        <w:rPr>
-          <w:rFonts w:ascii="Times New Roman" w:cs="Times New Roman" w:eastAsia="Times New Roman" w:hAnsi="Times New Roman"/>
-          <w:sz w:val="24"/>
-          <w:szCs w:val="24"/>
-        </w:rPr>
-        <w:t xml:space="preserve">La ampliacion del trabajo de integracion continua para que aplique tambien el procedimiento almacenado y las vistas analiticas sobre la base vacia.</w:t>
+        <w:t xml:space="preserve">El criterio de aceptacion fijado en la seccion 30 se cumple: la totalidad de los casos de severidad alta finaliza en estado aprobado, no quedan defectos abiertos de severidad alta ni critica, las pruebas automatizadas se ejecutan sin fallos sobre la rama principal y la integracion continua se encuentra en verde en el ultimo cambio integrado.</w:t>
       </w:r>
     </w:p>
     <w:p>
@@ -37380,7 +37353,7 @@
         <w:spacing w:after="240" w:before="360" w:line="480"/>
         <w:jc w:val="center"/>
       </w:pPr>
-      <w:bookmarkStart w:name="_Toc95" w:id="95"/>
+      <w:bookmarkStart w:name="_Toc94" w:id="94"/>
       <w:r>
         <w:rPr>
           <w:rFonts w:ascii="Times New Roman" w:cs="Times New Roman" w:eastAsia="Times New Roman" w:hAnsi="Times New Roman"/>
@@ -37391,7 +37364,7 @@
         </w:rPr>
         <w:t xml:space="preserve">39. Glosario</w:t>
       </w:r>
-      <w:bookmarkEnd w:id="95"/>
+      <w:bookmarkEnd w:id="94"/>
     </w:p>
     <w:p>
       <w:pPr>
@@ -37532,15 +37505,15 @@
           <w:sz w:val="24"/>
           <w:szCs w:val="24"/>
         </w:rPr>
-        <w:t xml:space="preserve">Contenedor.</w:t>
-      </w:r>
-      <w:r>
-        <w:rPr>
-          <w:rFonts w:ascii="Times New Roman" w:cs="Times New Roman" w:eastAsia="Times New Roman" w:hAnsi="Times New Roman"/>
-          <w:sz w:val="24"/>
-          <w:szCs w:val="24"/>
-        </w:rPr>
-        <w:t xml:space="preserve"> Forma de empaquetar una aplicacion con todo lo que necesita para ejecutarse, de manera que funcione igual en cualquier servidor.</w:t>
+        <w:t xml:space="preserve">Caso de borde.</w:t>
+      </w:r>
+      <w:r>
+        <w:rPr>
+          <w:rFonts w:ascii="Times New Roman" w:cs="Times New Roman" w:eastAsia="Times New Roman" w:hAnsi="Times New Roman"/>
+          <w:sz w:val="24"/>
+          <w:szCs w:val="24"/>
+        </w:rPr>
+        <w:t xml:space="preserve"> Situacion limite de una funcionalidad, como la fecha que vence justo hoy o la cantidad que iguala exactamente el stock disponible. Es donde se concentran los errores que la lectura del codigo no revela.</w:t>
       </w:r>
     </w:p>
     <w:p>
@@ -37682,15 +37655,15 @@
           <w:sz w:val="24"/>
           <w:szCs w:val="24"/>
         </w:rPr>
-        <w:t xml:space="preserve">Proxy inverso.</w:t>
-      </w:r>
-      <w:r>
-        <w:rPr>
-          <w:rFonts w:ascii="Times New Roman" w:cs="Times New Roman" w:eastAsia="Times New Roman" w:hAnsi="Times New Roman"/>
-          <w:sz w:val="24"/>
-          <w:szCs w:val="24"/>
-        </w:rPr>
-        <w:t xml:space="preserve"> Servidor que recibe las peticiones de Internet y las deriva internamente a la aplicacion correspondiente. En Kiosky tambien resuelve el cifrado y la autenticacion del sitio.</w:t>
+        <w:t xml:space="preserve">Modo memoria.</w:t>
+      </w:r>
+      <w:r>
+        <w:rPr>
+          <w:rFonts w:ascii="Times New Roman" w:cs="Times New Roman" w:eastAsia="Times New Roman" w:hAnsi="Times New Roman"/>
+          <w:sz w:val="24"/>
+          <w:szCs w:val="24"/>
+        </w:rPr>
+        <w:t xml:space="preserve"> Forma de ejecucion en la que el sistema carga el juego de datos de prueba en la memoria del proceso en lugar de leerlo de una base de datos. Permite arrancar sin servidor de base de datos y volver siempre al mismo estado conocido.</w:t>
       </w:r>
     </w:p>
     <w:p>
@@ -37874,7 +37847,7 @@
         <w:spacing w:after="240" w:before="360" w:line="480"/>
         <w:jc w:val="center"/>
       </w:pPr>
-      <w:bookmarkStart w:name="_Toc96" w:id="96"/>
+      <w:bookmarkStart w:name="_Toc95" w:id="95"/>
       <w:r>
         <w:rPr>
           <w:rFonts w:ascii="Times New Roman" w:cs="Times New Roman" w:eastAsia="Times New Roman" w:hAnsi="Times New Roman"/>
@@ -37885,7 +37858,7 @@
         </w:rPr>
         <w:t xml:space="preserve">40. Referencias</w:t>
       </w:r>
-      <w:bookmarkEnd w:id="96"/>
+      <w:bookmarkEnd w:id="95"/>
     </w:p>
     <w:p>
       <w:pPr>
@@ -37899,7 +37872,7 @@
           <w:sz w:val="24"/>
           <w:szCs w:val="24"/>
         </w:rPr>
-        <w:t xml:space="preserve">Caddy. (s. f.). *Caddy documentation*. https://caddyserver.com/docs/</w:t>
+        <w:t xml:space="preserve">Figma. (s. f.). *Figma*. https://www.figma.com/</w:t>
       </w:r>
     </w:p>
     <w:p>
@@ -37914,7 +37887,7 @@
           <w:sz w:val="24"/>
           <w:szCs w:val="24"/>
         </w:rPr>
-        <w:t xml:space="preserve">Docker. (s. f.). *Docker documentation*. https://docs.docker.com/</w:t>
+        <w:t xml:space="preserve">Git. (s. f.). *Documentacion de Git*. https://git-scm.com/doc</w:t>
       </w:r>
     </w:p>
     <w:p>
@@ -37929,7 +37902,7 @@
           <w:sz w:val="24"/>
           <w:szCs w:val="24"/>
         </w:rPr>
-        <w:t xml:space="preserve">Figma. (s. f.). *Figma*. https://www.figma.com/</w:t>
+        <w:t xml:space="preserve">GitHub. (s. f.). *GitHub Actions documentation*. https://docs.github.com/actions</w:t>
       </w:r>
     </w:p>
     <w:p>
@@ -37944,7 +37917,7 @@
           <w:sz w:val="24"/>
           <w:szCs w:val="24"/>
         </w:rPr>
-        <w:t xml:space="preserve">Git. (s. f.). *Documentacion de Git*. https://git-scm.com/doc</w:t>
+        <w:t xml:space="preserve">GitHub. (s. f.). *GitHub Copilot documentation*. https://docs.github.com/copilot</w:t>
       </w:r>
     </w:p>
     <w:p>
@@ -37959,7 +37932,7 @@
           <w:sz w:val="24"/>
           <w:szCs w:val="24"/>
         </w:rPr>
-        <w:t xml:space="preserve">GitHub. (s. f.). *GitHub Actions documentation*. https://docs.github.com/actions</w:t>
+        <w:t xml:space="preserve">Google. (s. f.). *Gemini para estudiantes*. https://gemini.google/students/</w:t>
       </w:r>
     </w:p>
     <w:p>
@@ -37974,7 +37947,7 @@
           <w:sz w:val="24"/>
           <w:szCs w:val="24"/>
         </w:rPr>
-        <w:t xml:space="preserve">GitHub. (s. f.). *GitHub Copilot documentation*. https://docs.github.com/copilot</w:t>
+        <w:t xml:space="preserve">Lucid Software. (s. f.). *Lucidchart*. https://lucid.co/lucidchart</w:t>
       </w:r>
     </w:p>
     <w:p>
@@ -37989,7 +37962,7 @@
           <w:sz w:val="24"/>
           <w:szCs w:val="24"/>
         </w:rPr>
-        <w:t xml:space="preserve">Google. (s. f.). *Gemini para estudiantes*. https://gemini.google/students/</w:t>
+        <w:t xml:space="preserve">Meta Open Source. (s. f.). *React*. https://react.dev/</w:t>
       </w:r>
     </w:p>
     <w:p>
@@ -38004,7 +37977,7 @@
           <w:sz w:val="24"/>
           <w:szCs w:val="24"/>
         </w:rPr>
-        <w:t xml:space="preserve">Lucid Software. (s. f.). *Lucidchart*. https://lucid.co/lucidchart</w:t>
+        <w:t xml:space="preserve">Microsoft. (s. f.). *Visual Studio Code documentation*. https://code.visualstudio.com/docs</w:t>
       </w:r>
     </w:p>
     <w:p>
@@ -38019,7 +37992,7 @@
           <w:sz w:val="24"/>
           <w:szCs w:val="24"/>
         </w:rPr>
-        <w:t xml:space="preserve">Meta Open Source. (s. f.). *React*. https://react.dev/</w:t>
+        <w:t xml:space="preserve">OpenJS Foundation. (s. f.). *Express*. https://expressjs.com/</w:t>
       </w:r>
     </w:p>
     <w:p>
@@ -38034,7 +38007,7 @@
           <w:sz w:val="24"/>
           <w:szCs w:val="24"/>
         </w:rPr>
-        <w:t xml:space="preserve">Microsoft. (s. f.). *Visual Studio Code documentation*. https://code.visualstudio.com/docs</w:t>
+        <w:t xml:space="preserve">OpenJS Foundation. (s. f.). *Node.js documentation*. https://nodejs.org/docs/latest-v20.x/api/</w:t>
       </w:r>
     </w:p>
     <w:p>
@@ -38049,7 +38022,7 @@
           <w:sz w:val="24"/>
           <w:szCs w:val="24"/>
         </w:rPr>
-        <w:t xml:space="preserve">OpenJS Foundation. (s. f.). *Express*. https://expressjs.com/</w:t>
+        <w:t xml:space="preserve">Oracle. (s. f.). *MySQL 8.0 reference manual*. https://dev.mysql.com/doc/refman/8.0/en/</w:t>
       </w:r>
     </w:p>
     <w:p>
@@ -38064,7 +38037,7 @@
           <w:sz w:val="24"/>
           <w:szCs w:val="24"/>
         </w:rPr>
-        <w:t xml:space="preserve">OpenJS Foundation. (s. f.). *Node.js documentation*. https://nodejs.org/docs/latest-v20.x/api/</w:t>
+        <w:t xml:space="preserve">Trello. (s. f.). *Trello*. https://trello.com/</w:t>
       </w:r>
     </w:p>
     <w:p>
@@ -38079,36 +38052,6 @@
           <w:sz w:val="24"/>
           <w:szCs w:val="24"/>
         </w:rPr>
-        <w:t xml:space="preserve">Oracle. (s. f.). *MySQL 8.0 reference manual*. https://dev.mysql.com/doc/refman/8.0/en/</w:t>
-      </w:r>
-    </w:p>
-    <w:p>
-      <w:pPr>
-        <w:spacing w:after="0" w:line="480"/>
-        <w:ind w:left="720" w:hanging="720"/>
-        <w:jc w:val="left"/>
-      </w:pPr>
-      <w:r>
-        <w:rPr>
-          <w:rFonts w:ascii="Times New Roman" w:cs="Times New Roman" w:eastAsia="Times New Roman" w:hAnsi="Times New Roman"/>
-          <w:sz w:val="24"/>
-          <w:szCs w:val="24"/>
-        </w:rPr>
-        <w:t xml:space="preserve">Trello. (s. f.). *Trello*. https://trello.com/</w:t>
-      </w:r>
-    </w:p>
-    <w:p>
-      <w:pPr>
-        <w:spacing w:after="0" w:line="480"/>
-        <w:ind w:left="720" w:hanging="720"/>
-        <w:jc w:val="left"/>
-      </w:pPr>
-      <w:r>
-        <w:rPr>
-          <w:rFonts w:ascii="Times New Roman" w:cs="Times New Roman" w:eastAsia="Times New Roman" w:hAnsi="Times New Roman"/>
-          <w:sz w:val="24"/>
-          <w:szCs w:val="24"/>
-        </w:rPr>
         <w:t xml:space="preserve">Vite. (s. f.). *Vite*. https://vite.dev/</w:t>
       </w:r>
     </w:p>
@@ -38117,7 +38060,7 @@
         <w:pStyle w:val="Heading2"/>
         <w:spacing w:after="120" w:before="240" w:line="480"/>
       </w:pPr>
-      <w:bookmarkStart w:name="_Toc97" w:id="97"/>
+      <w:bookmarkStart w:name="_Toc96" w:id="96"/>
       <w:r>
         <w:rPr>
           <w:rFonts w:ascii="Times New Roman" w:cs="Times New Roman" w:eastAsia="Times New Roman" w:hAnsi="Times New Roman"/>
@@ -38128,7 +38071,7 @@
         </w:rPr>
         <w:t xml:space="preserve">40.1. Recursos de formacion consultados</w:t>
       </w:r>
-      <w:bookmarkEnd w:id="97"/>
+      <w:bookmarkEnd w:id="96"/>
     </w:p>
     <w:p>
       <w:pPr>

</xml_diff>